<commit_message>
Docs: KT1 formatting aligned with methodology (Appendix G)
- Abstract (АНОТАЦІЯ) page before the table of contents
- Tables kept on one page together with their caption
- Column headings in singular form
- Exactly one blank line between chapter/section headings
- Source references in square brackets and a list of sources

Co-Authored-By: Claude Opus 5.5 <noreply@anthropic.com>
Claude-Session: https://claude.ai/code/session_01FCj8ZVzyxnGkTuDS4mm8L8
</commit_message>
<xml_diff>
--- a/docs/KT1_SMART_RESTAURANT.docx
+++ b/docs/KT1_SMART_RESTAURANT.docx
@@ -179,7 +179,52 @@
     </w:p>
     <w:p>
       <w:pPr>
-        <w:spacing w:before="0" w:after="280"/>
+        <w:spacing w:before="0" w:after="320"/>
+        <w:ind w:firstLine="0"/>
+        <w:jc w:val="center"/>
+      </w:pPr>
+      <w:r>
+        <w:rPr>
+          <w:b/>
+        </w:rPr>
+        <w:t>АНОТАЦІЯ</w:t>
+      </w:r>
+    </w:p>
+    <w:p>
+      <w:pPr>
+        <w:spacing w:before="0" w:after="0"/>
+      </w:pPr>
+      <w:r>
+        <w:rPr/>
+        <w:t>У курсовій роботі спроєктовано інформаційну систему ресторану SMART RESTAURANT, яка автоматизує обслуговування гостей у залі (онлайн-бронювання, QR check-in, замовлення зі смартфона, kitchen display, оплата) та власну службу доставки. Система складається з Web-застосунку, нативного мобільного застосунку та двох серверних систем — Restaurant API і Delivery API, — які працюють з однією базою даних PostgreSQL.</w:t>
+      </w:r>
+    </w:p>
+    <w:p>
+      <w:pPr>
+        <w:spacing w:before="0" w:after="0"/>
+      </w:pPr>
+      <w:r>
+        <w:rPr/>
+        <w:t>У першому розділі проведено аналіз предметної області та аналогів, визначено пʼять ролей користувачів, сформовано функціональні й нефункціональні вимоги, побудовано діаграми варіантів використання і специфікації ключових варіантів використання, виконано постановку задачі, складено матрицю функціональності, технологічний стек і перелік CORE та ADVANCED.</w:t>
+      </w:r>
+    </w:p>
+    <w:p>
+      <w:pPr>
+        <w:spacing w:before="0" w:after="0"/>
+      </w:pPr>
+      <w:r>
+        <w:rPr/>
+        <w:t>Другий розділ присвячено проєктуванню архітектури системи та взаємодії її компонентів, зокрема обміну подіями між двома серверними системами, а також логічної моделі бази даних.</w:t>
+      </w:r>
+    </w:p>
+    <w:p>
+      <w:r>
+        <w:br w:type="page"/>
+      </w:r>
+    </w:p>
+    <w:p>
+      <w:pPr>
+        <w:spacing w:before="0" w:after="320"/>
         <w:ind w:firstLine="0"/>
         <w:jc w:val="center"/>
       </w:pPr>
@@ -210,7 +255,7 @@
       <w:r>
         <w:t>ВСТУП</w:t>
         <w:tab/>
-        <w:t>3</w:t>
+        <w:t>4</w:t>
       </w:r>
     </w:p>
     <w:p>
@@ -224,7 +269,7 @@
       <w:r>
         <w:t>РОЗДІЛ 1. АНАЛІЗ ПРЕДМЕТНОЇ ОБЛАСТІ ТА ПОСТАНОВКА ЗАДАЧІ</w:t>
         <w:tab/>
-        <w:t>4</w:t>
+        <w:t>5</w:t>
       </w:r>
     </w:p>
     <w:p>
@@ -238,7 +283,7 @@
       <w:r>
         <w:t>1.1 Аналіз предметної області та існуючих програмних рішень</w:t>
         <w:tab/>
-        <w:t>4</w:t>
+        <w:t>5</w:t>
       </w:r>
     </w:p>
     <w:p>
@@ -252,7 +297,7 @@
       <w:r>
         <w:t>1.2 Формування вимог до програмної системи</w:t>
         <w:tab/>
-        <w:t>5</w:t>
+        <w:t>6</w:t>
       </w:r>
     </w:p>
     <w:p>
@@ -266,7 +311,7 @@
       <w:r>
         <w:t>1.2.1 Ролі</w:t>
         <w:tab/>
-        <w:t>5</w:t>
+        <w:t>6</w:t>
       </w:r>
     </w:p>
     <w:p>
@@ -280,7 +325,7 @@
       <w:r>
         <w:t>1.2.2 Функціональні вимоги</w:t>
         <w:tab/>
-        <w:t>6</w:t>
+        <w:t>7</w:t>
       </w:r>
     </w:p>
     <w:p>
@@ -294,7 +339,7 @@
       <w:r>
         <w:t>1.2.3 Нефункціональні вимоги</w:t>
         <w:tab/>
-        <w:t>8</w:t>
+        <w:t>9</w:t>
       </w:r>
     </w:p>
     <w:p>
@@ -308,7 +353,7 @@
       <w:r>
         <w:t>1.2.4 Діаграми варіантів використання</w:t>
         <w:tab/>
-        <w:t>9</w:t>
+        <w:t>10</w:t>
       </w:r>
     </w:p>
     <w:p>
@@ -322,7 +367,7 @@
       <w:r>
         <w:t>1.2.5 Специфікації ключових варіантів використання</w:t>
         <w:tab/>
-        <w:t>13</w:t>
+        <w:t>14</w:t>
       </w:r>
     </w:p>
     <w:p>
@@ -336,7 +381,7 @@
       <w:r>
         <w:t>1.3 Постановка задачі</w:t>
         <w:tab/>
-        <w:t>15</w:t>
+        <w:t>16</w:t>
       </w:r>
     </w:p>
     <w:p>
@@ -350,7 +395,7 @@
       <w:r>
         <w:t>1.3.1 Матриця функціональності</w:t>
         <w:tab/>
-        <w:t>16</w:t>
+        <w:t>17</w:t>
       </w:r>
     </w:p>
     <w:p>
@@ -364,7 +409,7 @@
       <w:r>
         <w:t>1.3.2 Технологічний стек</w:t>
         <w:tab/>
-        <w:t>16</w:t>
+        <w:t>17</w:t>
       </w:r>
     </w:p>
     <w:p>
@@ -378,7 +423,7 @@
       <w:r>
         <w:t>1.3.3 Перелік CORE та ADVANCED</w:t>
         <w:tab/>
-        <w:t>17</w:t>
+        <w:t>18</w:t>
       </w:r>
     </w:p>
     <w:p>
@@ -392,7 +437,7 @@
       <w:r>
         <w:t>РОЗДІЛ 2. ПРОЄКТУВАННЯ ТА ПРОГРАМНА РЕАЛІЗАЦІЯ СИСТЕМИ</w:t>
         <w:tab/>
-        <w:t>18</w:t>
+        <w:t>19</w:t>
       </w:r>
     </w:p>
     <w:p>
@@ -406,7 +451,7 @@
       <w:r>
         <w:t>2.1 Проєктування архітектури та взаємодії компонентів системи</w:t>
         <w:tab/>
-        <w:t>18</w:t>
+        <w:t>19</w:t>
       </w:r>
     </w:p>
     <w:p>
@@ -420,7 +465,21 @@
       <w:r>
         <w:t>2.2 Проєктування бази даних</w:t>
         <w:tab/>
-        <w:t>19</w:t>
+        <w:t>20</w:t>
+      </w:r>
+    </w:p>
+    <w:p>
+      <w:pPr>
+        <w:tabs>
+          <w:tab w:pos="9354" w:val="right" w:leader="dot"/>
+        </w:tabs>
+        <w:ind w:firstLine="0" w:left="0"/>
+        <w:jc w:val="left"/>
+      </w:pPr>
+      <w:r>
+        <w:t>СПИСОК ВИКОРИСТАНИХ ДЖЕРЕЛ</w:t>
+        <w:tab/>
+        <w:t>23</w:t>
       </w:r>
       <w:r>
         <w:fldChar w:fldCharType="end"/>
@@ -532,6 +591,7 @@
     <w:p>
       <w:pPr>
         <w:pStyle w:val="Heading2"/>
+        <w:spacing w:before="0"/>
       </w:pPr>
       <w:r>
         <w:t>1.1 Аналіз предметної області та існуючих програмних рішень</w:t>
@@ -835,7 +895,7 @@
       </w:r>
       <w:r>
         <w:rPr/>
-        <w:t xml:space="preserve"> Розглянуто чотири рішення: OpenTable (бронювання), Choice QR (електронне меню, Україна), Poster POS (система для персоналу, Україна) та Glovo (агрегатор доставки). Результати порівняння наведено в табл. 1.1.</w:t>
+        <w:t xml:space="preserve"> Розглянуто чотири рішення: OpenTable [1] (бронювання), Choice QR [2] (електронне меню, Україна), Poster POS [3] (система для персоналу, Україна) та Glovo [4] (агрегатор доставки). Результати порівняння наведено в табл. 1.1.</w:t>
       </w:r>
     </w:p>
     <w:p>
@@ -1024,6 +1084,7 @@
           </w:tcPr>
           <w:p>
             <w:pPr>
+              <w:keepNext/>
               <w:spacing w:line="240" w:lineRule="auto"/>
               <w:ind w:firstLine="0"/>
               <w:jc w:val="left"/>
@@ -1042,6 +1103,7 @@
           </w:tcPr>
           <w:p>
             <w:pPr>
+              <w:keepNext/>
               <w:spacing w:line="240" w:lineRule="auto"/>
               <w:ind w:firstLine="0"/>
               <w:jc w:val="left"/>
@@ -1060,6 +1122,7 @@
           </w:tcPr>
           <w:p>
             <w:pPr>
+              <w:keepNext/>
               <w:spacing w:line="240" w:lineRule="auto"/>
               <w:ind w:firstLine="0"/>
               <w:jc w:val="left"/>
@@ -1078,6 +1141,7 @@
           </w:tcPr>
           <w:p>
             <w:pPr>
+              <w:keepNext/>
               <w:spacing w:line="240" w:lineRule="auto"/>
               <w:ind w:firstLine="0"/>
               <w:jc w:val="left"/>
@@ -1096,6 +1160,7 @@
           </w:tcPr>
           <w:p>
             <w:pPr>
+              <w:keepNext/>
               <w:spacing w:line="240" w:lineRule="auto"/>
               <w:ind w:firstLine="0"/>
               <w:jc w:val="left"/>
@@ -1114,6 +1179,7 @@
           </w:tcPr>
           <w:p>
             <w:pPr>
+              <w:keepNext/>
               <w:spacing w:line="240" w:lineRule="auto"/>
               <w:ind w:firstLine="0"/>
               <w:jc w:val="left"/>
@@ -1137,6 +1203,7 @@
           </w:tcPr>
           <w:p>
             <w:pPr>
+              <w:keepNext/>
               <w:spacing w:line="240" w:lineRule="auto"/>
               <w:ind w:firstLine="0"/>
               <w:jc w:val="left"/>
@@ -1155,6 +1222,7 @@
           </w:tcPr>
           <w:p>
             <w:pPr>
+              <w:keepNext/>
               <w:spacing w:line="240" w:lineRule="auto"/>
               <w:ind w:firstLine="0"/>
               <w:jc w:val="left"/>
@@ -1173,6 +1241,7 @@
           </w:tcPr>
           <w:p>
             <w:pPr>
+              <w:keepNext/>
               <w:spacing w:line="240" w:lineRule="auto"/>
               <w:ind w:firstLine="0"/>
               <w:jc w:val="left"/>
@@ -1191,6 +1260,7 @@
           </w:tcPr>
           <w:p>
             <w:pPr>
+              <w:keepNext/>
               <w:spacing w:line="240" w:lineRule="auto"/>
               <w:ind w:firstLine="0"/>
               <w:jc w:val="left"/>
@@ -1209,6 +1279,7 @@
           </w:tcPr>
           <w:p>
             <w:pPr>
+              <w:keepNext/>
               <w:spacing w:line="240" w:lineRule="auto"/>
               <w:ind w:firstLine="0"/>
               <w:jc w:val="left"/>
@@ -1227,6 +1298,7 @@
           </w:tcPr>
           <w:p>
             <w:pPr>
+              <w:keepNext/>
               <w:spacing w:line="240" w:lineRule="auto"/>
               <w:ind w:firstLine="0"/>
               <w:jc w:val="left"/>
@@ -1250,6 +1322,7 @@
           </w:tcPr>
           <w:p>
             <w:pPr>
+              <w:keepNext/>
               <w:spacing w:line="240" w:lineRule="auto"/>
               <w:ind w:firstLine="0"/>
               <w:jc w:val="left"/>
@@ -1268,6 +1341,7 @@
           </w:tcPr>
           <w:p>
             <w:pPr>
+              <w:keepNext/>
               <w:spacing w:line="240" w:lineRule="auto"/>
               <w:ind w:firstLine="0"/>
               <w:jc w:val="left"/>
@@ -1286,6 +1360,7 @@
           </w:tcPr>
           <w:p>
             <w:pPr>
+              <w:keepNext/>
               <w:spacing w:line="240" w:lineRule="auto"/>
               <w:ind w:firstLine="0"/>
               <w:jc w:val="left"/>
@@ -1304,6 +1379,7 @@
           </w:tcPr>
           <w:p>
             <w:pPr>
+              <w:keepNext/>
               <w:spacing w:line="240" w:lineRule="auto"/>
               <w:ind w:firstLine="0"/>
               <w:jc w:val="left"/>
@@ -1322,6 +1398,7 @@
           </w:tcPr>
           <w:p>
             <w:pPr>
+              <w:keepNext/>
               <w:spacing w:line="240" w:lineRule="auto"/>
               <w:ind w:firstLine="0"/>
               <w:jc w:val="left"/>
@@ -1340,6 +1417,7 @@
           </w:tcPr>
           <w:p>
             <w:pPr>
+              <w:keepNext/>
               <w:spacing w:line="240" w:lineRule="auto"/>
               <w:ind w:firstLine="0"/>
               <w:jc w:val="left"/>
@@ -1363,6 +1441,7 @@
           </w:tcPr>
           <w:p>
             <w:pPr>
+              <w:keepNext/>
               <w:spacing w:line="240" w:lineRule="auto"/>
               <w:ind w:firstLine="0"/>
               <w:jc w:val="left"/>
@@ -1381,6 +1460,7 @@
           </w:tcPr>
           <w:p>
             <w:pPr>
+              <w:keepNext/>
               <w:spacing w:line="240" w:lineRule="auto"/>
               <w:ind w:firstLine="0"/>
               <w:jc w:val="left"/>
@@ -1399,6 +1479,7 @@
           </w:tcPr>
           <w:p>
             <w:pPr>
+              <w:keepNext/>
               <w:spacing w:line="240" w:lineRule="auto"/>
               <w:ind w:firstLine="0"/>
               <w:jc w:val="left"/>
@@ -1417,6 +1498,7 @@
           </w:tcPr>
           <w:p>
             <w:pPr>
+              <w:keepNext/>
               <w:spacing w:line="240" w:lineRule="auto"/>
               <w:ind w:firstLine="0"/>
               <w:jc w:val="left"/>
@@ -1435,6 +1517,7 @@
           </w:tcPr>
           <w:p>
             <w:pPr>
+              <w:keepNext/>
               <w:spacing w:line="240" w:lineRule="auto"/>
               <w:ind w:firstLine="0"/>
               <w:jc w:val="left"/>
@@ -1453,6 +1536,7 @@
           </w:tcPr>
           <w:p>
             <w:pPr>
+              <w:keepNext/>
               <w:spacing w:line="240" w:lineRule="auto"/>
               <w:ind w:firstLine="0"/>
               <w:jc w:val="left"/>
@@ -1476,6 +1560,7 @@
           </w:tcPr>
           <w:p>
             <w:pPr>
+              <w:keepNext/>
               <w:spacing w:line="240" w:lineRule="auto"/>
               <w:ind w:firstLine="0"/>
               <w:jc w:val="left"/>
@@ -1494,6 +1579,7 @@
           </w:tcPr>
           <w:p>
             <w:pPr>
+              <w:keepNext/>
               <w:spacing w:line="240" w:lineRule="auto"/>
               <w:ind w:firstLine="0"/>
               <w:jc w:val="left"/>
@@ -1512,6 +1598,7 @@
           </w:tcPr>
           <w:p>
             <w:pPr>
+              <w:keepNext/>
               <w:spacing w:line="240" w:lineRule="auto"/>
               <w:ind w:firstLine="0"/>
               <w:jc w:val="left"/>
@@ -1530,6 +1617,7 @@
           </w:tcPr>
           <w:p>
             <w:pPr>
+              <w:keepNext/>
               <w:spacing w:line="240" w:lineRule="auto"/>
               <w:ind w:firstLine="0"/>
               <w:jc w:val="left"/>
@@ -1548,6 +1636,7 @@
           </w:tcPr>
           <w:p>
             <w:pPr>
+              <w:keepNext/>
               <w:spacing w:line="240" w:lineRule="auto"/>
               <w:ind w:firstLine="0"/>
               <w:jc w:val="left"/>
@@ -1566,6 +1655,7 @@
           </w:tcPr>
           <w:p>
             <w:pPr>
+              <w:keepNext/>
               <w:spacing w:line="240" w:lineRule="auto"/>
               <w:ind w:firstLine="0"/>
               <w:jc w:val="left"/>
@@ -1589,6 +1679,7 @@
           </w:tcPr>
           <w:p>
             <w:pPr>
+              <w:keepNext/>
               <w:spacing w:line="240" w:lineRule="auto"/>
               <w:ind w:firstLine="0"/>
               <w:jc w:val="left"/>
@@ -1607,6 +1698,7 @@
           </w:tcPr>
           <w:p>
             <w:pPr>
+              <w:keepNext/>
               <w:spacing w:line="240" w:lineRule="auto"/>
               <w:ind w:firstLine="0"/>
               <w:jc w:val="left"/>
@@ -1625,6 +1717,7 @@
           </w:tcPr>
           <w:p>
             <w:pPr>
+              <w:keepNext/>
               <w:spacing w:line="240" w:lineRule="auto"/>
               <w:ind w:firstLine="0"/>
               <w:jc w:val="left"/>
@@ -1643,6 +1736,7 @@
           </w:tcPr>
           <w:p>
             <w:pPr>
+              <w:keepNext/>
               <w:spacing w:line="240" w:lineRule="auto"/>
               <w:ind w:firstLine="0"/>
               <w:jc w:val="left"/>
@@ -1661,6 +1755,7 @@
           </w:tcPr>
           <w:p>
             <w:pPr>
+              <w:keepNext/>
               <w:spacing w:line="240" w:lineRule="auto"/>
               <w:ind w:firstLine="0"/>
               <w:jc w:val="left"/>
@@ -1679,6 +1774,7 @@
           </w:tcPr>
           <w:p>
             <w:pPr>
+              <w:keepNext/>
               <w:spacing w:line="240" w:lineRule="auto"/>
               <w:ind w:firstLine="0"/>
               <w:jc w:val="left"/>
@@ -1702,6 +1798,7 @@
           </w:tcPr>
           <w:p>
             <w:pPr>
+              <w:keepNext/>
               <w:spacing w:line="240" w:lineRule="auto"/>
               <w:ind w:firstLine="0"/>
               <w:jc w:val="left"/>
@@ -1720,6 +1817,7 @@
           </w:tcPr>
           <w:p>
             <w:pPr>
+              <w:keepNext/>
               <w:spacing w:line="240" w:lineRule="auto"/>
               <w:ind w:firstLine="0"/>
               <w:jc w:val="left"/>
@@ -1738,6 +1836,7 @@
           </w:tcPr>
           <w:p>
             <w:pPr>
+              <w:keepNext/>
               <w:spacing w:line="240" w:lineRule="auto"/>
               <w:ind w:firstLine="0"/>
               <w:jc w:val="left"/>
@@ -1756,6 +1855,7 @@
           </w:tcPr>
           <w:p>
             <w:pPr>
+              <w:keepNext/>
               <w:spacing w:line="240" w:lineRule="auto"/>
               <w:ind w:firstLine="0"/>
               <w:jc w:val="left"/>
@@ -1774,6 +1874,7 @@
           </w:tcPr>
           <w:p>
             <w:pPr>
+              <w:keepNext/>
               <w:spacing w:line="240" w:lineRule="auto"/>
               <w:ind w:firstLine="0"/>
               <w:jc w:val="left"/>
@@ -1792,6 +1893,7 @@
           </w:tcPr>
           <w:p>
             <w:pPr>
+              <w:keepNext/>
               <w:spacing w:line="240" w:lineRule="auto"/>
               <w:ind w:firstLine="0"/>
               <w:jc w:val="left"/>
@@ -2029,6 +2131,7 @@
     <w:p>
       <w:pPr>
         <w:pStyle w:val="Heading3"/>
+        <w:spacing w:before="0"/>
       </w:pPr>
       <w:r>
         <w:t>1.2.1 Ролі</w:t>
@@ -2161,7 +2264,7 @@
       </w:pPr>
       <w:r>
         <w:rPr/>
-        <w:t>Кожна вимога має ідентифікатор для трасування у варіантах використання та тестах.</w:t>
+        <w:t>Вимоги сформовано за підходом інженерії вимог [12]: кожна вимога має ідентифікатор для трасування у варіантах використання та тестах.</w:t>
       </w:r>
     </w:p>
     <w:p>
@@ -3621,7 +3724,7 @@
                 <w:b/>
                 <w:sz w:val="24"/>
               </w:rPr>
-              <w:t>Ролі</w:t>
+              <w:t>Роль</w:t>
             </w:r>
           </w:p>
         </w:tc>
@@ -3696,6 +3799,7 @@
           </w:tcPr>
           <w:p>
             <w:pPr>
+              <w:keepNext/>
               <w:spacing w:line="240" w:lineRule="auto"/>
               <w:ind w:firstLine="0"/>
               <w:jc w:val="left"/>
@@ -3714,6 +3818,7 @@
           </w:tcPr>
           <w:p>
             <w:pPr>
+              <w:keepNext/>
               <w:spacing w:line="240" w:lineRule="auto"/>
               <w:ind w:firstLine="0"/>
               <w:jc w:val="left"/>
@@ -3732,6 +3837,7 @@
           </w:tcPr>
           <w:p>
             <w:pPr>
+              <w:keepNext/>
               <w:spacing w:line="240" w:lineRule="auto"/>
               <w:ind w:firstLine="0"/>
               <w:jc w:val="left"/>
@@ -3750,6 +3856,7 @@
           </w:tcPr>
           <w:p>
             <w:pPr>
+              <w:keepNext/>
               <w:spacing w:line="240" w:lineRule="auto"/>
               <w:ind w:firstLine="0"/>
               <w:jc w:val="left"/>
@@ -3768,6 +3875,7 @@
           </w:tcPr>
           <w:p>
             <w:pPr>
+              <w:keepNext/>
               <w:spacing w:line="240" w:lineRule="auto"/>
               <w:ind w:firstLine="0"/>
               <w:jc w:val="left"/>
@@ -3791,6 +3899,7 @@
           </w:tcPr>
           <w:p>
             <w:pPr>
+              <w:keepNext/>
               <w:spacing w:line="240" w:lineRule="auto"/>
               <w:ind w:firstLine="0"/>
               <w:jc w:val="left"/>
@@ -3809,6 +3918,7 @@
           </w:tcPr>
           <w:p>
             <w:pPr>
+              <w:keepNext/>
               <w:spacing w:line="240" w:lineRule="auto"/>
               <w:ind w:firstLine="0"/>
               <w:jc w:val="left"/>
@@ -3827,6 +3937,7 @@
           </w:tcPr>
           <w:p>
             <w:pPr>
+              <w:keepNext/>
               <w:spacing w:line="240" w:lineRule="auto"/>
               <w:ind w:firstLine="0"/>
               <w:jc w:val="left"/>
@@ -3845,6 +3956,7 @@
           </w:tcPr>
           <w:p>
             <w:pPr>
+              <w:keepNext/>
               <w:spacing w:line="240" w:lineRule="auto"/>
               <w:ind w:firstLine="0"/>
               <w:jc w:val="left"/>
@@ -3863,6 +3975,7 @@
           </w:tcPr>
           <w:p>
             <w:pPr>
+              <w:keepNext/>
               <w:spacing w:line="240" w:lineRule="auto"/>
               <w:ind w:firstLine="0"/>
               <w:jc w:val="left"/>
@@ -3886,6 +3999,7 @@
           </w:tcPr>
           <w:p>
             <w:pPr>
+              <w:keepNext/>
               <w:spacing w:line="240" w:lineRule="auto"/>
               <w:ind w:firstLine="0"/>
               <w:jc w:val="left"/>
@@ -3904,6 +4018,7 @@
           </w:tcPr>
           <w:p>
             <w:pPr>
+              <w:keepNext/>
               <w:spacing w:line="240" w:lineRule="auto"/>
               <w:ind w:firstLine="0"/>
               <w:jc w:val="left"/>
@@ -3922,6 +4037,7 @@
           </w:tcPr>
           <w:p>
             <w:pPr>
+              <w:keepNext/>
               <w:spacing w:line="240" w:lineRule="auto"/>
               <w:ind w:firstLine="0"/>
               <w:jc w:val="left"/>
@@ -3940,6 +4056,7 @@
           </w:tcPr>
           <w:p>
             <w:pPr>
+              <w:keepNext/>
               <w:spacing w:line="240" w:lineRule="auto"/>
               <w:ind w:firstLine="0"/>
               <w:jc w:val="left"/>
@@ -3958,6 +4075,7 @@
           </w:tcPr>
           <w:p>
             <w:pPr>
+              <w:keepNext/>
               <w:spacing w:line="240" w:lineRule="auto"/>
               <w:ind w:firstLine="0"/>
               <w:jc w:val="left"/>
@@ -3981,6 +4099,7 @@
           </w:tcPr>
           <w:p>
             <w:pPr>
+              <w:keepNext/>
               <w:spacing w:line="240" w:lineRule="auto"/>
               <w:ind w:firstLine="0"/>
               <w:jc w:val="left"/>
@@ -3999,6 +4118,7 @@
           </w:tcPr>
           <w:p>
             <w:pPr>
+              <w:keepNext/>
               <w:spacing w:line="240" w:lineRule="auto"/>
               <w:ind w:firstLine="0"/>
               <w:jc w:val="left"/>
@@ -4017,6 +4137,7 @@
           </w:tcPr>
           <w:p>
             <w:pPr>
+              <w:keepNext/>
               <w:spacing w:line="240" w:lineRule="auto"/>
               <w:ind w:firstLine="0"/>
               <w:jc w:val="left"/>
@@ -4035,6 +4156,7 @@
           </w:tcPr>
           <w:p>
             <w:pPr>
+              <w:keepNext/>
               <w:spacing w:line="240" w:lineRule="auto"/>
               <w:ind w:firstLine="0"/>
               <w:jc w:val="left"/>
@@ -4053,6 +4175,7 @@
           </w:tcPr>
           <w:p>
             <w:pPr>
+              <w:keepNext/>
               <w:spacing w:line="240" w:lineRule="auto"/>
               <w:ind w:firstLine="0"/>
               <w:jc w:val="left"/>
@@ -4076,6 +4199,7 @@
           </w:tcPr>
           <w:p>
             <w:pPr>
+              <w:keepNext/>
               <w:spacing w:line="240" w:lineRule="auto"/>
               <w:ind w:firstLine="0"/>
               <w:jc w:val="left"/>
@@ -4094,6 +4218,7 @@
           </w:tcPr>
           <w:p>
             <w:pPr>
+              <w:keepNext/>
               <w:spacing w:line="240" w:lineRule="auto"/>
               <w:ind w:firstLine="0"/>
               <w:jc w:val="left"/>
@@ -4112,6 +4237,7 @@
           </w:tcPr>
           <w:p>
             <w:pPr>
+              <w:keepNext/>
               <w:spacing w:line="240" w:lineRule="auto"/>
               <w:ind w:firstLine="0"/>
               <w:jc w:val="left"/>
@@ -4130,6 +4256,7 @@
           </w:tcPr>
           <w:p>
             <w:pPr>
+              <w:keepNext/>
               <w:spacing w:line="240" w:lineRule="auto"/>
               <w:ind w:firstLine="0"/>
               <w:jc w:val="left"/>
@@ -4148,6 +4275,7 @@
           </w:tcPr>
           <w:p>
             <w:pPr>
+              <w:keepNext/>
               <w:spacing w:line="240" w:lineRule="auto"/>
               <w:ind w:firstLine="0"/>
               <w:jc w:val="left"/>
@@ -4171,6 +4299,7 @@
           </w:tcPr>
           <w:p>
             <w:pPr>
+              <w:keepNext/>
               <w:spacing w:line="240" w:lineRule="auto"/>
               <w:ind w:firstLine="0"/>
               <w:jc w:val="left"/>
@@ -4189,6 +4318,7 @@
           </w:tcPr>
           <w:p>
             <w:pPr>
+              <w:keepNext/>
               <w:spacing w:line="240" w:lineRule="auto"/>
               <w:ind w:firstLine="0"/>
               <w:jc w:val="left"/>
@@ -4207,6 +4337,7 @@
           </w:tcPr>
           <w:p>
             <w:pPr>
+              <w:keepNext/>
               <w:spacing w:line="240" w:lineRule="auto"/>
               <w:ind w:firstLine="0"/>
               <w:jc w:val="left"/>
@@ -4225,6 +4356,7 @@
           </w:tcPr>
           <w:p>
             <w:pPr>
+              <w:keepNext/>
               <w:spacing w:line="240" w:lineRule="auto"/>
               <w:ind w:firstLine="0"/>
               <w:jc w:val="left"/>
@@ -4243,6 +4375,7 @@
           </w:tcPr>
           <w:p>
             <w:pPr>
+              <w:keepNext/>
               <w:spacing w:line="240" w:lineRule="auto"/>
               <w:ind w:firstLine="0"/>
               <w:jc w:val="left"/>
@@ -4266,6 +4399,7 @@
           </w:tcPr>
           <w:p>
             <w:pPr>
+              <w:keepNext/>
               <w:spacing w:line="240" w:lineRule="auto"/>
               <w:ind w:firstLine="0"/>
               <w:jc w:val="left"/>
@@ -4284,6 +4418,7 @@
           </w:tcPr>
           <w:p>
             <w:pPr>
+              <w:keepNext/>
               <w:spacing w:line="240" w:lineRule="auto"/>
               <w:ind w:firstLine="0"/>
               <w:jc w:val="left"/>
@@ -4302,6 +4437,7 @@
           </w:tcPr>
           <w:p>
             <w:pPr>
+              <w:keepNext/>
               <w:spacing w:line="240" w:lineRule="auto"/>
               <w:ind w:firstLine="0"/>
               <w:jc w:val="left"/>
@@ -4320,6 +4456,7 @@
           </w:tcPr>
           <w:p>
             <w:pPr>
+              <w:keepNext/>
               <w:spacing w:line="240" w:lineRule="auto"/>
               <w:ind w:firstLine="0"/>
               <w:jc w:val="left"/>
@@ -4338,6 +4475,7 @@
           </w:tcPr>
           <w:p>
             <w:pPr>
+              <w:keepNext/>
               <w:spacing w:line="240" w:lineRule="auto"/>
               <w:ind w:firstLine="0"/>
               <w:jc w:val="left"/>
@@ -4361,6 +4499,7 @@
           </w:tcPr>
           <w:p>
             <w:pPr>
+              <w:keepNext/>
               <w:spacing w:line="240" w:lineRule="auto"/>
               <w:ind w:firstLine="0"/>
               <w:jc w:val="left"/>
@@ -4379,6 +4518,7 @@
           </w:tcPr>
           <w:p>
             <w:pPr>
+              <w:keepNext/>
               <w:spacing w:line="240" w:lineRule="auto"/>
               <w:ind w:firstLine="0"/>
               <w:jc w:val="left"/>
@@ -4397,6 +4537,7 @@
           </w:tcPr>
           <w:p>
             <w:pPr>
+              <w:keepNext/>
               <w:spacing w:line="240" w:lineRule="auto"/>
               <w:ind w:firstLine="0"/>
               <w:jc w:val="left"/>
@@ -4415,6 +4556,7 @@
           </w:tcPr>
           <w:p>
             <w:pPr>
+              <w:keepNext/>
               <w:spacing w:line="240" w:lineRule="auto"/>
               <w:ind w:firstLine="0"/>
               <w:jc w:val="left"/>
@@ -4433,6 +4575,7 @@
           </w:tcPr>
           <w:p>
             <w:pPr>
+              <w:keepNext/>
               <w:spacing w:line="240" w:lineRule="auto"/>
               <w:ind w:firstLine="0"/>
               <w:jc w:val="left"/>
@@ -4456,6 +4599,7 @@
           </w:tcPr>
           <w:p>
             <w:pPr>
+              <w:keepNext/>
               <w:spacing w:line="240" w:lineRule="auto"/>
               <w:ind w:firstLine="0"/>
               <w:jc w:val="left"/>
@@ -4474,6 +4618,7 @@
           </w:tcPr>
           <w:p>
             <w:pPr>
+              <w:keepNext/>
               <w:spacing w:line="240" w:lineRule="auto"/>
               <w:ind w:firstLine="0"/>
               <w:jc w:val="left"/>
@@ -4492,6 +4637,7 @@
           </w:tcPr>
           <w:p>
             <w:pPr>
+              <w:keepNext/>
               <w:spacing w:line="240" w:lineRule="auto"/>
               <w:ind w:firstLine="0"/>
               <w:jc w:val="left"/>
@@ -4510,6 +4656,7 @@
           </w:tcPr>
           <w:p>
             <w:pPr>
+              <w:keepNext/>
               <w:spacing w:line="240" w:lineRule="auto"/>
               <w:ind w:firstLine="0"/>
               <w:jc w:val="left"/>
@@ -4528,6 +4675,7 @@
           </w:tcPr>
           <w:p>
             <w:pPr>
+              <w:keepNext/>
               <w:spacing w:line="240" w:lineRule="auto"/>
               <w:ind w:firstLine="0"/>
               <w:jc w:val="left"/>
@@ -4551,6 +4699,7 @@
           </w:tcPr>
           <w:p>
             <w:pPr>
+              <w:keepNext/>
               <w:spacing w:line="240" w:lineRule="auto"/>
               <w:ind w:firstLine="0"/>
               <w:jc w:val="left"/>
@@ -4569,6 +4718,7 @@
           </w:tcPr>
           <w:p>
             <w:pPr>
+              <w:keepNext/>
               <w:spacing w:line="240" w:lineRule="auto"/>
               <w:ind w:firstLine="0"/>
               <w:jc w:val="left"/>
@@ -4587,6 +4737,7 @@
           </w:tcPr>
           <w:p>
             <w:pPr>
+              <w:keepNext/>
               <w:spacing w:line="240" w:lineRule="auto"/>
               <w:ind w:firstLine="0"/>
               <w:jc w:val="left"/>
@@ -4605,6 +4756,7 @@
           </w:tcPr>
           <w:p>
             <w:pPr>
+              <w:keepNext/>
               <w:spacing w:line="240" w:lineRule="auto"/>
               <w:ind w:firstLine="0"/>
               <w:jc w:val="left"/>
@@ -4623,6 +4775,7 @@
           </w:tcPr>
           <w:p>
             <w:pPr>
+              <w:keepNext/>
               <w:spacing w:line="240" w:lineRule="auto"/>
               <w:ind w:firstLine="0"/>
               <w:jc w:val="left"/>
@@ -4646,6 +4799,7 @@
           </w:tcPr>
           <w:p>
             <w:pPr>
+              <w:keepNext/>
               <w:spacing w:line="240" w:lineRule="auto"/>
               <w:ind w:firstLine="0"/>
               <w:jc w:val="left"/>
@@ -4664,6 +4818,7 @@
           </w:tcPr>
           <w:p>
             <w:pPr>
+              <w:keepNext/>
               <w:spacing w:line="240" w:lineRule="auto"/>
               <w:ind w:firstLine="0"/>
               <w:jc w:val="left"/>
@@ -4682,6 +4837,7 @@
           </w:tcPr>
           <w:p>
             <w:pPr>
+              <w:keepNext/>
               <w:spacing w:line="240" w:lineRule="auto"/>
               <w:ind w:firstLine="0"/>
               <w:jc w:val="left"/>
@@ -4700,6 +4856,7 @@
           </w:tcPr>
           <w:p>
             <w:pPr>
+              <w:keepNext/>
               <w:spacing w:line="240" w:lineRule="auto"/>
               <w:ind w:firstLine="0"/>
               <w:jc w:val="left"/>
@@ -4718,6 +4875,7 @@
           </w:tcPr>
           <w:p>
             <w:pPr>
+              <w:keepNext/>
               <w:spacing w:line="240" w:lineRule="auto"/>
               <w:ind w:firstLine="0"/>
               <w:jc w:val="left"/>
@@ -4741,6 +4899,7 @@
           </w:tcPr>
           <w:p>
             <w:pPr>
+              <w:keepNext/>
               <w:spacing w:line="240" w:lineRule="auto"/>
               <w:ind w:firstLine="0"/>
               <w:jc w:val="left"/>
@@ -4759,6 +4918,7 @@
           </w:tcPr>
           <w:p>
             <w:pPr>
+              <w:keepNext/>
               <w:spacing w:line="240" w:lineRule="auto"/>
               <w:ind w:firstLine="0"/>
               <w:jc w:val="left"/>
@@ -4777,6 +4937,7 @@
           </w:tcPr>
           <w:p>
             <w:pPr>
+              <w:keepNext/>
               <w:spacing w:line="240" w:lineRule="auto"/>
               <w:ind w:firstLine="0"/>
               <w:jc w:val="left"/>
@@ -4795,6 +4956,7 @@
           </w:tcPr>
           <w:p>
             <w:pPr>
+              <w:keepNext/>
               <w:spacing w:line="240" w:lineRule="auto"/>
               <w:ind w:firstLine="0"/>
               <w:jc w:val="left"/>
@@ -4813,6 +4975,7 @@
           </w:tcPr>
           <w:p>
             <w:pPr>
+              <w:keepNext/>
               <w:spacing w:line="240" w:lineRule="auto"/>
               <w:ind w:firstLine="0"/>
               <w:jc w:val="left"/>
@@ -4836,6 +4999,7 @@
           </w:tcPr>
           <w:p>
             <w:pPr>
+              <w:keepNext/>
               <w:spacing w:line="240" w:lineRule="auto"/>
               <w:ind w:firstLine="0"/>
               <w:jc w:val="left"/>
@@ -4854,6 +5018,7 @@
           </w:tcPr>
           <w:p>
             <w:pPr>
+              <w:keepNext/>
               <w:spacing w:line="240" w:lineRule="auto"/>
               <w:ind w:firstLine="0"/>
               <w:jc w:val="left"/>
@@ -4872,6 +5037,7 @@
           </w:tcPr>
           <w:p>
             <w:pPr>
+              <w:keepNext/>
               <w:spacing w:line="240" w:lineRule="auto"/>
               <w:ind w:firstLine="0"/>
               <w:jc w:val="left"/>
@@ -4890,6 +5056,7 @@
           </w:tcPr>
           <w:p>
             <w:pPr>
+              <w:keepNext/>
               <w:spacing w:line="240" w:lineRule="auto"/>
               <w:ind w:firstLine="0"/>
               <w:jc w:val="left"/>
@@ -4908,6 +5075,7 @@
           </w:tcPr>
           <w:p>
             <w:pPr>
+              <w:keepNext/>
               <w:spacing w:line="240" w:lineRule="auto"/>
               <w:ind w:firstLine="0"/>
               <w:jc w:val="left"/>
@@ -5055,7 +5223,7 @@
       </w:r>
       <w:r>
         <w:rPr/>
-        <w:t xml:space="preserve"> Node.js 22, Express 5, zod для валідації, JWT і bcrypt, Socket.IO, Luxon для часових поясів.</w:t>
+        <w:t xml:space="preserve"> Node.js 22, Express 5 [7], zod для валідації, JWT і bcrypt, Socket.IO [10], Luxon для часових поясів.</w:t>
       </w:r>
     </w:p>
     <w:p>
@@ -5074,7 +5242,7 @@
       </w:r>
       <w:r>
         <w:rPr/>
-        <w:t xml:space="preserve"> PostgreSQL 16, Prisma ORM і міграції; LISTEN/NOTIFY для подій між системами.</w:t>
+        <w:t xml:space="preserve"> PostgreSQL 16 [8], Prisma ORM і міграції [9]; LISTEN/NOTIFY для подій між системами.</w:t>
       </w:r>
     </w:p>
     <w:p>
@@ -5093,7 +5261,7 @@
       </w:r>
       <w:r>
         <w:rPr/>
-        <w:t xml:space="preserve"> React 19, Vite, Tailwind CSS 4, React Router 7, TanStack Query, Recharts.</w:t>
+        <w:t xml:space="preserve"> React 19 [5], Vite, Tailwind CSS 4, React Router 7, TanStack Query, Recharts.</w:t>
       </w:r>
     </w:p>
     <w:p>
@@ -5112,7 +5280,7 @@
       </w:r>
       <w:r>
         <w:rPr/>
-        <w:t xml:space="preserve"> React Native (Expo SDK 57), React Navigation 7, expo-camera, expo-notifications, expo-secure-store.</w:t>
+        <w:t xml:space="preserve"> React Native (Expo SDK 57) [6], React Navigation 7, expo-camera, expo-notifications, expo-secure-store.</w:t>
       </w:r>
     </w:p>
     <w:p>
@@ -5169,7 +5337,7 @@
       </w:r>
       <w:r>
         <w:rPr/>
-        <w:t xml:space="preserve"> OpenAPI 3.1 і Swagger UI для кожної системи, генерується з коду.</w:t>
+        <w:t xml:space="preserve"> OpenAPI 3.1 [11] і Swagger UI для кожної системи, генерується з коду.</w:t>
       </w:r>
     </w:p>
     <w:p>
@@ -5522,7 +5690,7 @@
       </w:r>
       <w:r>
         <w:rPr/>
-        <w:t xml:space="preserve"> Кожна система записує зміни у спільні таблиці у власній транзакції. Після успішного запису вона надсилає подію через механізм PostgreSQL LISTEN/NOTIFY (канал sr_orders). Друга система слухає цей канал, читає актуальний стан замовлення з бази даних і сповіщає своїх клієнтів. Приклад:</w:t>
+        <w:t xml:space="preserve"> Кожна система записує зміни у спільні таблиці у власній транзакції. Після успішного запису вона надсилає подію через механізм PostgreSQL LISTEN/NOTIFY [8] (канал sr_orders). Друга система слухає цей канал, читає актуальний стан замовлення з бази даних і сповіщає своїх клієнтів. Приклад:</w:t>
       </w:r>
     </w:p>
     <w:p>
@@ -5865,6 +6033,134 @@
       <w:r>
         <w:rPr/>
         <w:t xml:space="preserve"> ціни, тарифи, кількість і суми лише в допустимих межах; гроші зберігаються в копійках.</w:t>
+      </w:r>
+    </w:p>
+    <w:p>
+      <w:pPr>
+        <w:pStyle w:val="Heading1"/>
+      </w:pPr>
+      <w:r>
+        <w:t>СПИСОК ВИКОРИСТАНИХ ДЖЕРЕЛ</w:t>
+      </w:r>
+    </w:p>
+    <w:p>
+      <w:pPr>
+        <w:spacing w:before="0" w:after="0"/>
+        <w:jc w:val="left"/>
+      </w:pPr>
+      <w:r>
+        <w:rPr/>
+        <w:t>1. OpenTable. Restaurant reservations [Електронний ресурс]. – Режим доступу: https://www.opentable.com</w:t>
+      </w:r>
+    </w:p>
+    <w:p>
+      <w:pPr>
+        <w:spacing w:before="0" w:after="0"/>
+        <w:jc w:val="left"/>
+      </w:pPr>
+      <w:r>
+        <w:rPr/>
+        <w:t>2. Choice QR. Електронне меню та онлайн-замовлення для закладів [Електронний ресурс]. – Режим доступу: https://choiceqr.com</w:t>
+      </w:r>
+    </w:p>
+    <w:p>
+      <w:pPr>
+        <w:spacing w:before="0" w:after="0"/>
+        <w:jc w:val="left"/>
+      </w:pPr>
+      <w:r>
+        <w:rPr/>
+        <w:t>3. Poster POS. Система автоматизації закладів харчування [Електронний ресурс]. – Режим доступу: https://joinposter.com</w:t>
+      </w:r>
+    </w:p>
+    <w:p>
+      <w:pPr>
+        <w:spacing w:before="0" w:after="0"/>
+        <w:jc w:val="left"/>
+      </w:pPr>
+      <w:r>
+        <w:rPr/>
+        <w:t>4. Glovo. Доставка їжі та товарів [Електронний ресурс]. – Режим доступу: https://glovoapp.com</w:t>
+      </w:r>
+    </w:p>
+    <w:p>
+      <w:pPr>
+        <w:spacing w:before="0" w:after="0"/>
+        <w:jc w:val="left"/>
+      </w:pPr>
+      <w:r>
+        <w:rPr/>
+        <w:t>5. React. Documentation [Електронний ресурс]. – Режим доступу: https://react.dev</w:t>
+      </w:r>
+    </w:p>
+    <w:p>
+      <w:pPr>
+        <w:spacing w:before="0" w:after="0"/>
+        <w:jc w:val="left"/>
+      </w:pPr>
+      <w:r>
+        <w:rPr/>
+        <w:t>6. Expo. Documentation [Електронний ресурс]. – Режим доступу: https://docs.expo.dev</w:t>
+      </w:r>
+    </w:p>
+    <w:p>
+      <w:pPr>
+        <w:spacing w:before="0" w:after="0"/>
+        <w:jc w:val="left"/>
+      </w:pPr>
+      <w:r>
+        <w:rPr/>
+        <w:t>7. Express. Node.js web application framework [Електронний ресурс]. – Режим доступу: https://expressjs.com</w:t>
+      </w:r>
+    </w:p>
+    <w:p>
+      <w:pPr>
+        <w:spacing w:before="0" w:after="0"/>
+        <w:jc w:val="left"/>
+      </w:pPr>
+      <w:r>
+        <w:rPr/>
+        <w:t>8. PostgreSQL 16 Documentation [Електронний ресурс]. – Режим доступу: https://www.postgresql.org/docs/16/</w:t>
+      </w:r>
+    </w:p>
+    <w:p>
+      <w:pPr>
+        <w:spacing w:before="0" w:after="0"/>
+        <w:jc w:val="left"/>
+      </w:pPr>
+      <w:r>
+        <w:rPr/>
+        <w:t>9. Prisma ORM. Documentation [Електронний ресурс]. – Режим доступу: https://www.prisma.io/docs</w:t>
+      </w:r>
+    </w:p>
+    <w:p>
+      <w:pPr>
+        <w:spacing w:before="0" w:after="0"/>
+        <w:jc w:val="left"/>
+      </w:pPr>
+      <w:r>
+        <w:rPr/>
+        <w:t>10. Socket.IO. Documentation [Електронний ресурс]. – Режим доступу: https://socket.io/docs/v4/</w:t>
+      </w:r>
+    </w:p>
+    <w:p>
+      <w:pPr>
+        <w:spacing w:before="0" w:after="0"/>
+        <w:jc w:val="left"/>
+      </w:pPr>
+      <w:r>
+        <w:rPr/>
+        <w:t>11. OpenAPI Specification v3.1.0 [Електронний ресурс]. – Режим доступу: https://spec.openapis.org/oas/v3.1.0</w:t>
+      </w:r>
+    </w:p>
+    <w:p>
+      <w:pPr>
+        <w:spacing w:before="0" w:after="0"/>
+        <w:jc w:val="left"/>
+      </w:pPr>
+      <w:r>
+        <w:rPr/>
+        <w:t>12. Software Requirements (Developer Best Practices) 3rd Edition / Karl Wiegers, Joy Beatty. – Print2print, 2013. – 672 p.</w:t>
       </w:r>
     </w:p>
     <w:sectPr>
@@ -6336,7 +6632,7 @@
       <w:keepNext/>
       <w:keepLines/>
       <w:pageBreakBefore/>
-      <w:spacing w:before="0" w:after="280" w:line="276" w:lineRule="auto"/>
+      <w:spacing w:before="0" w:after="320" w:line="276" w:lineRule="auto"/>
       <w:ind w:firstLine="0"/>
       <w:jc w:val="center"/>
       <w:outlineLvl w:val="0"/>
@@ -6363,7 +6659,7 @@
     <w:pPr>
       <w:keepNext/>
       <w:keepLines/>
-      <w:spacing w:before="280" w:after="140" w:line="276" w:lineRule="auto"/>
+      <w:spacing w:before="320" w:after="160" w:line="276" w:lineRule="auto"/>
       <w:ind w:firstLine="567"/>
       <w:jc w:val="left"/>
       <w:outlineLvl w:val="1"/>
@@ -6390,7 +6686,7 @@
     <w:pPr>
       <w:keepNext/>
       <w:keepLines/>
-      <w:spacing w:before="280" w:after="140" w:line="276" w:lineRule="auto"/>
+      <w:spacing w:before="320" w:after="160" w:line="276" w:lineRule="auto"/>
       <w:ind w:firstLine="567"/>
       <w:jc w:val="left"/>
       <w:outlineLvl w:val="2"/>

</xml_diff>

<commit_message>
Docs: full explanatory note, KT1 aligned with the methodology
- docs/KR_SMART_RESTAURANT.docx: complete explanatory note following the
  recommended structure (abstract, introduction, chapters 1–3,
  conclusions, sources, appendices: code listings, traceability and
  launch materials, technical assignment); formatting per Appendix G
- KT1: use case specifications with trigger and postconditions,
  functionality matrix with the methodology columns, users and needs,
  non-CRUD justification, geolocation in requirements and diagrams
- New state machine diagram; use case diagrams updated; fresh web
  screenshots with delivery tickets on the kitchen display and kanban
- docs/coursework-src: markdown sources, diagram renderer and the Word
  builder so both documents can be rebuilt (build.sh, render.mjs)

Co-Authored-By: Claude Opus 5.5 <noreply@anthropic.com>
Claude-Session: https://claude.ai/code/session_01FCj8ZVzyxnGkTuDS4mm8L8
</commit_message>
<xml_diff>
--- a/docs/KT1_SMART_RESTAURANT.docx
+++ b/docs/KT1_SMART_RESTAURANT.docx
@@ -297,7 +297,7 @@
       <w:r>
         <w:t>1.2 Формування вимог до програмної системи</w:t>
         <w:tab/>
-        <w:t>6</w:t>
+        <w:t>7</w:t>
       </w:r>
     </w:p>
     <w:p>
@@ -311,7 +311,7 @@
       <w:r>
         <w:t>1.2.1 Ролі</w:t>
         <w:tab/>
-        <w:t>6</w:t>
+        <w:t>7</w:t>
       </w:r>
     </w:p>
     <w:p>
@@ -325,7 +325,7 @@
       <w:r>
         <w:t>1.2.2 Функціональні вимоги</w:t>
         <w:tab/>
-        <w:t>7</w:t>
+        <w:t>8</w:t>
       </w:r>
     </w:p>
     <w:p>
@@ -339,7 +339,7 @@
       <w:r>
         <w:t>1.2.3 Нефункціональні вимоги</w:t>
         <w:tab/>
-        <w:t>9</w:t>
+        <w:t>10</w:t>
       </w:r>
     </w:p>
     <w:p>
@@ -353,7 +353,7 @@
       <w:r>
         <w:t>1.2.4 Діаграми варіантів використання</w:t>
         <w:tab/>
-        <w:t>10</w:t>
+        <w:t>11</w:t>
       </w:r>
     </w:p>
     <w:p>
@@ -381,7 +381,7 @@
       <w:r>
         <w:t>1.3 Постановка задачі</w:t>
         <w:tab/>
-        <w:t>16</w:t>
+        <w:t>17</w:t>
       </w:r>
     </w:p>
     <w:p>
@@ -395,7 +395,7 @@
       <w:r>
         <w:t>1.3.1 Матриця функціональності</w:t>
         <w:tab/>
-        <w:t>17</w:t>
+        <w:t>18</w:t>
       </w:r>
     </w:p>
     <w:p>
@@ -409,7 +409,7 @@
       <w:r>
         <w:t>1.3.2 Технологічний стек</w:t>
         <w:tab/>
-        <w:t>17</w:t>
+        <w:t>18</w:t>
       </w:r>
     </w:p>
     <w:p>
@@ -423,7 +423,7 @@
       <w:r>
         <w:t>1.3.3 Перелік CORE та ADVANCED</w:t>
         <w:tab/>
-        <w:t>18</w:t>
+        <w:t>19</w:t>
       </w:r>
     </w:p>
     <w:p>
@@ -437,7 +437,7 @@
       <w:r>
         <w:t>РОЗДІЛ 2. ПРОЄКТУВАННЯ ТА ПРОГРАМНА РЕАЛІЗАЦІЯ СИСТЕМИ</w:t>
         <w:tab/>
-        <w:t>19</w:t>
+        <w:t>20</w:t>
       </w:r>
     </w:p>
     <w:p>
@@ -451,7 +451,7 @@
       <w:r>
         <w:t>2.1 Проєктування архітектури та взаємодії компонентів системи</w:t>
         <w:tab/>
-        <w:t>19</w:t>
+        <w:t>20</w:t>
       </w:r>
     </w:p>
     <w:p>
@@ -465,7 +465,7 @@
       <w:r>
         <w:t>2.2 Проєктування бази даних</w:t>
         <w:tab/>
-        <w:t>20</w:t>
+        <w:t>21</w:t>
       </w:r>
     </w:p>
     <w:p>
@@ -479,7 +479,7 @@
       <w:r>
         <w:t>СПИСОК ВИКОРИСТАНИХ ДЖЕРЕЛ</w:t>
         <w:tab/>
-        <w:t>23</w:t>
+        <w:t>24</w:t>
       </w:r>
       <w:r>
         <w:fldChar w:fldCharType="end"/>
@@ -603,7 +603,7 @@
       </w:pPr>
       <w:r>
         <w:rPr/>
-        <w:t>Предметна область — робота ресторану з обслуговуванням у залі та доставкою. Аналіз типового візиту показав такі «вузькі місця»:</w:t>
+        <w:t>Предметна область — робота ресторану з обслуговуванням гостей у залі та доставкою страв додому. Аналіз типового візиту показав такі «вузькі місця»:</w:t>
       </w:r>
     </w:p>
     <w:p>
@@ -737,6 +737,21 @@
       <w:r>
         <w:rPr/>
         <w:t xml:space="preserve"> віддана стороннім агрегаторам: ресторан платить комісію, не контролює час доставки та не має власних даних про клієнтів.</w:t>
+      </w:r>
+    </w:p>
+    <w:p>
+      <w:pPr>
+        <w:spacing w:before="0" w:after="0"/>
+      </w:pPr>
+      <w:r>
+        <w:rPr>
+          <w:b/>
+        </w:rPr>
+        <w:t>Користувачі системи та їхні потреби.</w:t>
+      </w:r>
+      <w:r>
+        <w:rPr/>
+        <w:t xml:space="preserve"> Гість хоче швидко забронювати зручний столик, бачити меню й статус замовлення, платити без очікування рахунку, а вдома — замовити доставку з передбачуваним часом. Хостес і офіціант потребують єдиного списку бронювань, живого плану залу і миттєвих сигналів про нові замовлення та готові страви. Кухарю потрібна черга замовлень із таймерами замість паперових чеків. Курʼєру — список замовлень, адреса, маршрут і контакт клієнта. Адміністратору — керування меню, столиками, користувачами, зонами доставки та аналітика.</w:t>
       </w:r>
     </w:p>
     <w:p>
@@ -2117,7 +2132,22 @@
       </w:pPr>
       <w:r>
         <w:rPr/>
-        <w:t>Жоден аналог не покриває повний цикл «бронювання → check-in → замовлення → кухня → оплата» разом із власною доставкою. Ця ніша і визначає функціональність Smart Restaurant.</w:t>
+        <w:t>З аналогів доцільно взяти: автоматичний підбір столика й нагадування (OpenTable), замовлення за QR-кодом на столику (Choice QR), екран кухні з таймерами (Poster POS), відстеження доставки наживо з прогнозом часу (Glovo). Жоден аналог не покриває повний цикл «бронювання → check-in → замовлення → кухня → оплата» разом із власною доставкою — ця ніша і визначає функціональність Smart Restaurant.</w:t>
+      </w:r>
+    </w:p>
+    <w:p>
+      <w:pPr>
+        <w:spacing w:before="0" w:after="0"/>
+      </w:pPr>
+      <w:r>
+        <w:rPr>
+          <w:b/>
+        </w:rPr>
+        <w:t>Відмінність від простого CRUD-застосунку.</w:t>
+      </w:r>
+      <w:r>
+        <w:rPr/>
+        <w:t xml:space="preserve"> Система не обмежується створенням і редагуванням записів: бронювання, замовлення й доставки проходять скінченні автомати станів із правилами, хто і коли може змінити статус; booking engine підбирає столик за штрафною функцією й гарантує відсутність перетинів на рівні бази даних; оплата має 3-D Secure, ідемпотентність і повернення коштів; дві серверні системи обмінюються подіями в реальному часі.</w:t>
       </w:r>
     </w:p>
     <w:p>
@@ -2219,7 +2249,7 @@
       </w:r>
       <w:r>
         <w:rPr/>
-        <w:t xml:space="preserve"> (COURIER, нова роль): лише мобільний застосунок. Бере замовлення, забирає їх з кухні та доставляє клієнтам.</w:t>
+        <w:t xml:space="preserve"> (COURIER): лише мобільний застосунок. Бере замовлення, забирає їх з кухні та доставляє клієнтам.</w:t>
       </w:r>
     </w:p>
     <w:p>
@@ -2238,7 +2268,7 @@
       </w:r>
       <w:r>
         <w:rPr/>
-        <w:t xml:space="preserve"> (ADMIN): Web і Mobile. Керує меню, столиками, користувачами, зонами доставки; переглядає аналітику; має всі права працівника залу.</w:t>
+        <w:t xml:space="preserve"> (ADMIN, технічна роль): Web і Mobile. Керує меню, столиками, користувачами, зонами доставки; переглядає аналітику; має всі права працівника залу.</w:t>
       </w:r>
     </w:p>
     <w:p>
@@ -2247,7 +2277,7 @@
       </w:pPr>
       <w:r>
         <w:rPr/>
-        <w:t>Окремо діє актор «Система» — фонові задачі, які автоматично скасовують непідтверджені бронювання, позначають no-show і скасовують неоплачені онлайн-замовлення на доставку.</w:t>
+        <w:t>Бізнес-ролі відрізняються операціями, правами, сценаріями й доступними даними: клієнт бачить лише свої бронювання й замовлення, працівник залу не може перевести замовлення в «Готується», кухар — підтвердити бронювання, курʼєр — бачити замовлення в залі. Окремо діє актор «Система» — фонові задачі, які автоматично скасовують непідтверджені бронювання, позначають no-show і скасовують неоплачені онлайн-замовлення на доставку.</w:t>
       </w:r>
     </w:p>
     <w:p>
@@ -2264,7 +2294,7 @@
       </w:pPr>
       <w:r>
         <w:rPr/>
-        <w:t>Вимоги сформовано за підходом інженерії вимог [12]: кожна вимога має ідентифікатор для трасування у варіантах використання та тестах.</w:t>
+        <w:t>Вимоги сформовано окремо для кожної ролі за підходом інженерії вимог [12]; кожна має ідентифікатор для трасування у варіантах використання, API, таблицях бази даних і тестах.</w:t>
       </w:r>
     </w:p>
     <w:p>
@@ -2439,7 +2469,16 @@
       </w:pPr>
       <w:r>
         <w:rPr/>
-        <w:t>– FR-D07 — доставки в історії замовлень, відгук після отримання.</w:t>
+        <w:t>– FR-D07 — доставки в історії замовлень, відгук після отримання;</w:t>
+      </w:r>
+    </w:p>
+    <w:p>
+      <w:pPr>
+        <w:spacing w:before="0" w:after="0"/>
+      </w:pPr>
+      <w:r>
+        <w:rPr/>
+        <w:t>– FR-D08 — визначення району й адреси доставки за геолокацією телефона.</w:t>
       </w:r>
     </w:p>
     <w:p>
@@ -2589,7 +2628,7 @@
       </w:pPr>
       <w:r>
         <w:rPr/>
-        <w:t>– FR-R01 — черга вільних замовлень із сповіщенням про нові;</w:t>
+        <w:t>– FR-R01 — черга вільних замовлень зі сповіщенням про нові;</w:t>
       </w:r>
     </w:p>
     <w:p>
@@ -2681,7 +2720,7 @@
       </w:pPr>
       <w:r>
         <w:rPr/>
-        <w:t>– FR-A04 — зони доставки: тариф, мінімальна сума, поріг безкоштовної доставки, вимкнення;</w:t>
+        <w:t>– FR-A04 — зони доставки: тариф, мінімальна сума, поріг безкоштовної доставки, вимкнення, центр і радіус для геолокації;</w:t>
       </w:r>
     </w:p>
     <w:p>
@@ -2760,11 +2799,11 @@
         <w:rPr>
           <w:b/>
         </w:rPr>
-        <w:t>Цілісність даних:</w:t>
+        <w:t>Безпека:</w:t>
       </w:r>
       <w:r>
         <w:rPr/>
-        <w:t xml:space="preserve"> обмеження CHECK, FK, UNIQUE, EXCLUDE і тригер на рівні PostgreSQL; журнал змін статусів; гроші зберігаються в копійках.</w:t>
+        <w:t xml:space="preserve"> паролі хешуються bcrypt; access-токен JWT діє 30 хв; refresh-токени одноразові й зберігаються як SHA-256; перевірка прав і валідація всіх вхідних даних на сервері; повний номер картки і CVC не зберігаються; HTTPS; обмеження частоти входу.</w:t>
       </w:r>
     </w:p>
     <w:p>
@@ -2779,11 +2818,11 @@
         <w:rPr>
           <w:b/>
         </w:rPr>
-        <w:t>Безпека:</w:t>
+        <w:t>Usability:</w:t>
       </w:r>
       <w:r>
         <w:rPr/>
-        <w:t xml:space="preserve"> паролі хешуються bcrypt; access-токен JWT діє 30 хв; refresh-токени одноразові й зберігаються як SHA-256; один вхід діє в обох системах.</w:t>
+        <w:t xml:space="preserve"> mobile-first інтерфейс, сповіщення, вібрація, зрозумілі повідомлення про помилки українською.</w:t>
       </w:r>
     </w:p>
     <w:p>
@@ -2798,49 +2837,11 @@
         <w:rPr>
           <w:b/>
         </w:rPr>
-        <w:t>Безпека:</w:t>
+        <w:t>Адаптивність:</w:t>
       </w:r>
       <w:r>
         <w:rPr/>
-        <w:t xml:space="preserve"> перевірка прав і валідація всіх вхідних даних на сервері; повний номер картки і CVC не зберігаються; HTTPS; обмеження частоти входу.</w:t>
-      </w:r>
-    </w:p>
-    <w:p>
-      <w:pPr>
-        <w:spacing w:before="0" w:after="0"/>
-      </w:pPr>
-      <w:r>
-        <w:rPr/>
-        <w:t xml:space="preserve">– </w:t>
-      </w:r>
-      <w:r>
-        <w:rPr>
-          <w:b/>
-        </w:rPr>
-        <w:t>Незалежність систем:</w:t>
-      </w:r>
-      <w:r>
-        <w:rPr/>
-        <w:t xml:space="preserve"> Restaurant API і Delivery API запускаються окремими процесами (контейнерами); зупинка доставки не впливає на роботу залу.</w:t>
-      </w:r>
-    </w:p>
-    <w:p>
-      <w:pPr>
-        <w:spacing w:before="0" w:after="0"/>
-      </w:pPr>
-      <w:r>
-        <w:rPr/>
-        <w:t xml:space="preserve">– </w:t>
-      </w:r>
-      <w:r>
-        <w:rPr>
-          <w:b/>
-        </w:rPr>
-        <w:t>Зручність:</w:t>
-      </w:r>
-      <w:r>
-        <w:rPr/>
-        <w:t xml:space="preserve"> mobile-first інтерфейс, сповіщення, вибрація, зрозумілі повідомлення про помилки українською.</w:t>
+        <w:t xml:space="preserve"> Web коректно працює на екранах від 360 до 1920 px.</w:t>
       </w:r>
     </w:p>
     <w:p>
@@ -2859,7 +2860,7 @@
       </w:r>
       <w:r>
         <w:rPr/>
-        <w:t xml:space="preserve"> Web — сучасні браузери від 360 до 1920 px; Mobile — iOS і Android (нативний застосунок, не WebView).</w:t>
+        <w:t xml:space="preserve"> Web — сучасні браузери; Mobile — iOS і Android (нативний застосунок, не WebView).</w:t>
       </w:r>
     </w:p>
     <w:p>
@@ -2878,15 +2879,26 @@
       </w:r>
       <w:r>
         <w:rPr/>
-        <w:t xml:space="preserve"> обидва API не зберігають стан сесії (JWT), тому їх можна запускати в кількох екземплярах.</w:t>
+        <w:t xml:space="preserve"> обидва API не зберігають стан сесії (JWT), тому їх можна запускати в кількох екземплярах; Restaurant API і Delivery API запускаються окремими процесами, зупинка доставки не впливає на роботу залу.</w:t>
       </w:r>
     </w:p>
     <w:p>
       <w:pPr>
-        <w:pStyle w:val="Heading3"/>
-      </w:pPr>
-      <w:r>
-        <w:t>1.2.4 Діаграми варіантів використання</w:t>
+        <w:spacing w:before="0" w:after="0"/>
+      </w:pPr>
+      <w:r>
+        <w:rPr/>
+        <w:t xml:space="preserve">– </w:t>
+      </w:r>
+      <w:r>
+        <w:rPr>
+          <w:b/>
+        </w:rPr>
+        <w:t>Збереження даних:</w:t>
+      </w:r>
+      <w:r>
+        <w:rPr/>
+        <w:t xml:space="preserve"> PostgreSQL з міграціями; обмеження CHECK, FK, UNIQUE, EXCLUDE і тригер; журнал змін статусів; гроші зберігаються в копійках.</w:t>
       </w:r>
     </w:p>
     <w:p>
@@ -2895,7 +2907,34 @@
       </w:pPr>
       <w:r>
         <w:rPr/>
-        <w:t>Діаграми варіантів використання побудовано окремо для кожної ролі (рис. 1.1–1.5). Зліва розташовано актора та основні варіанти використання, праворуч від пунктирної лінії — окремі групи функцій (доставка, аналітика, зміна курʼєра).</w:t>
+        <w:t xml:space="preserve">– </w:t>
+      </w:r>
+      <w:r>
+        <w:rPr>
+          <w:b/>
+        </w:rPr>
+        <w:t>Оброблення помилок:</w:t>
+      </w:r>
+      <w:r>
+        <w:rPr/>
+        <w:t xml:space="preserve"> єдиний формат помилки з кодом і людським повідомленням; при конфлікті бронювання — альтернативні слоти; кожна вимога має автоматизовану перевірку (розділ 3).</w:t>
+      </w:r>
+    </w:p>
+    <w:p>
+      <w:pPr>
+        <w:pStyle w:val="Heading3"/>
+      </w:pPr>
+      <w:r>
+        <w:t>1.2.4 Діаграми варіантів використання</w:t>
+      </w:r>
+    </w:p>
+    <w:p>
+      <w:pPr>
+        <w:spacing w:before="0" w:after="0"/>
+      </w:pPr>
+      <w:r>
+        <w:rPr/>
+        <w:t>Діаграми варіантів використання побудовано окремо для кожної ролі (рис. 1.1–1.5). Зліва розташовано актора та основні варіанти використання, праворуч від пунктирної лінії — окремі групи функцій (доставка, аналітика, зміна курʼєра). Діаграми відповідають фактично реалізованим екранам і endpoint системи.</w:t>
       </w:r>
     </w:p>
     <w:p>
@@ -2917,7 +2956,7 @@
               <a:graphicData uri="http://schemas.openxmlformats.org/drawingml/2006/picture">
                 <pic:pic>
                   <pic:nvPicPr>
-                    <pic:cNvPr id="0" name="client.png"/>
+                    <pic:cNvPr id="0" name="use-case-client.png"/>
                     <pic:cNvPicPr/>
                   </pic:nvPicPr>
                   <pic:blipFill>
@@ -2942,7 +2981,7 @@
     </w:p>
     <w:p>
       <w:pPr>
-        <w:spacing w:before="120" w:after="160"/>
+        <w:spacing w:before="120" w:after="200"/>
         <w:ind w:firstLine="0"/>
         <w:jc w:val="center"/>
       </w:pPr>
@@ -2970,7 +3009,7 @@
               <a:graphicData uri="http://schemas.openxmlformats.org/drawingml/2006/picture">
                 <pic:pic>
                   <pic:nvPicPr>
-                    <pic:cNvPr id="0" name="staff.png"/>
+                    <pic:cNvPr id="0" name="use-case-staff.png"/>
                     <pic:cNvPicPr/>
                   </pic:nvPicPr>
                   <pic:blipFill>
@@ -2995,7 +3034,7 @@
     </w:p>
     <w:p>
       <w:pPr>
-        <w:spacing w:before="120" w:after="160"/>
+        <w:spacing w:before="120" w:after="200"/>
         <w:ind w:firstLine="0"/>
         <w:jc w:val="center"/>
       </w:pPr>
@@ -3023,7 +3062,7 @@
               <a:graphicData uri="http://schemas.openxmlformats.org/drawingml/2006/picture">
                 <pic:pic>
                   <pic:nvPicPr>
-                    <pic:cNvPr id="0" name="kitchen.png"/>
+                    <pic:cNvPr id="0" name="use-case-kitchen.png"/>
                     <pic:cNvPicPr/>
                   </pic:nvPicPr>
                   <pic:blipFill>
@@ -3048,7 +3087,7 @@
     </w:p>
     <w:p>
       <w:pPr>
-        <w:spacing w:before="120" w:after="160"/>
+        <w:spacing w:before="120" w:after="200"/>
         <w:ind w:firstLine="0"/>
         <w:jc w:val="center"/>
       </w:pPr>
@@ -3076,7 +3115,7 @@
               <a:graphicData uri="http://schemas.openxmlformats.org/drawingml/2006/picture">
                 <pic:pic>
                   <pic:nvPicPr>
-                    <pic:cNvPr id="0" name="admin.png"/>
+                    <pic:cNvPr id="0" name="use-case-admin.png"/>
                     <pic:cNvPicPr/>
                   </pic:nvPicPr>
                   <pic:blipFill>
@@ -3101,7 +3140,7 @@
     </w:p>
     <w:p>
       <w:pPr>
-        <w:spacing w:before="120" w:after="160"/>
+        <w:spacing w:before="120" w:after="200"/>
         <w:ind w:firstLine="0"/>
         <w:jc w:val="center"/>
       </w:pPr>
@@ -3129,7 +3168,7 @@
               <a:graphicData uri="http://schemas.openxmlformats.org/drawingml/2006/picture">
                 <pic:pic>
                   <pic:nvPicPr>
-                    <pic:cNvPr id="0" name="courier.png"/>
+                    <pic:cNvPr id="0" name="use-case-courier.png"/>
                     <pic:cNvPicPr/>
                   </pic:nvPicPr>
                   <pic:blipFill>
@@ -3154,7 +3193,7 @@
     </w:p>
     <w:p>
       <w:pPr>
-        <w:spacing w:before="120" w:after="160"/>
+        <w:spacing w:before="120" w:after="200"/>
         <w:ind w:firstLine="0"/>
         <w:jc w:val="center"/>
       </w:pPr>
@@ -3169,7 +3208,7 @@
       </w:pPr>
       <w:r>
         <w:rPr/>
-        <w:t>Пунктирна стрілка «include» іде від базового варіанта до його обовʼязкової частини: наприклад, бронювання завжди включає підбір столика. Стрілка «extend» іде від розширення до базового варіанта і означає дію, яка виконується лише за певної умови: 3-D Secure, оплата готівкою курʼєру, повернення коштів. Адміністратор успадковує всі варіанти використання працівника залу.</w:t>
+        <w:t>Пунктирна стрілка «include» іде від базового варіанта до його обовʼязкової частини: наприклад, бронювання завжди включає підбір столика. Стрілка «extend» іде від розширення до базового варіанта і означає дію, яка виконується лише за певної умови: 3-D Secure, оплата готівкою курʼєру, визначення адреси за GPS, повернення коштів. Адміністратор успадковує всі варіанти використання працівника залу (узагальнення).</w:t>
       </w:r>
     </w:p>
     <w:p>
@@ -3186,7 +3225,7 @@
       </w:pPr>
       <w:r>
         <w:rPr/>
-        <w:t>Нижче описано сім ключових варіантів використання, які разом покривають обидва процеси: обслуговування в залі та доставку.</w:t>
+        <w:t>Нижче описано сім ключових варіантів використання, які разом покривають обидва процеси. Номери UC наскрізні: за ними вимоги трасуються до API, таблиць бази даних, екранів і тестів.</w:t>
       </w:r>
     </w:p>
     <w:p>
@@ -3199,16 +3238,56 @@
         </w:rPr>
         <w:t>UC-03 «Забронювати столик».</w:t>
       </w:r>
-      <w:r>
-        <w:rPr/>
-        <w:t xml:space="preserve"> Актор: клієнт (Mobile або Web). Передумови: клієнт увійшов у систему і має менше трьох активних бронювань.</w:t>
-      </w:r>
     </w:p>
     <w:p>
       <w:pPr>
         <w:spacing w:before="0" w:after="0"/>
       </w:pPr>
       <w:r>
+        <w:rPr>
+          <w:b/>
+        </w:rPr>
+        <w:t>Актор:</w:t>
+      </w:r>
+      <w:r>
+        <w:rPr/>
+        <w:t xml:space="preserve"> клієнт (Mobile або Web). </w:t>
+      </w:r>
+      <w:r>
+        <w:rPr>
+          <w:b/>
+        </w:rPr>
+        <w:t>Передумови:</w:t>
+      </w:r>
+      <w:r>
+        <w:rPr/>
+        <w:t xml:space="preserve"> клієнт увійшов у систему і має менше трьох активних бронювань. </w:t>
+      </w:r>
+      <w:r>
+        <w:rPr>
+          <w:b/>
+        </w:rPr>
+        <w:t>Тригер:</w:t>
+      </w:r>
+      <w:r>
+        <w:rPr/>
+        <w:t xml:space="preserve"> клієнт відкриває екран бронювання.</w:t>
+      </w:r>
+    </w:p>
+    <w:p>
+      <w:pPr>
+        <w:spacing w:before="0" w:after="0"/>
+      </w:pPr>
+      <w:r>
+        <w:rPr/>
+        <w:t>Основний сценарій:</w:t>
+      </w:r>
+    </w:p>
+    <w:p>
+      <w:pPr>
+        <w:spacing w:before="0" w:after="0"/>
+      </w:pPr>
+      <w:r>
         <w:rPr/>
         <w:t>1) Клієнт обирає дату, кількість гостей і зону залу.</w:t>
       </w:r>
@@ -3245,8 +3324,24 @@
         <w:spacing w:before="0" w:after="0"/>
       </w:pPr>
       <w:r>
+        <w:rPr>
+          <w:b/>
+        </w:rPr>
+        <w:t>Альтернативні сценарії та винятки:</w:t>
+      </w:r>
+      <w:r>
         <w:rPr/>
-        <w:t>Альтернативи: клієнт може обрати інший вільний столик на плані; якщо столик щойно зайняли, система пропонує альтернативні слоти. Результат: бронювання в базі даних, персонал бачить його в реальному часі.</w:t>
+        <w:t xml:space="preserve"> клієнт може обрати інший вільний столик на плані; якщо столик щойно зайняли, система повертає 409 з альтернативними слотами; час поза годинами роботи, у минулому або менше ніж за 30 хв — 422. </w:t>
+      </w:r>
+      <w:r>
+        <w:rPr>
+          <w:b/>
+        </w:rPr>
+        <w:t>Постумови:</w:t>
+      </w:r>
+      <w:r>
+        <w:rPr/>
+        <w:t xml:space="preserve"> бронювання збережено в базі даних, персонал бачить його в реальному часі.</w:t>
       </w:r>
     </w:p>
     <w:p>
@@ -3259,18 +3354,40 @@
         </w:rPr>
         <w:t>UC-05 «Check-in за QR столика».</w:t>
       </w:r>
-      <w:r>
-        <w:rPr/>
-        <w:t xml:space="preserve"> Актор: клієнт (Mobile, камера). Передумови: підтверджене бронювання на цей столик або вільний столик.</w:t>
-      </w:r>
     </w:p>
     <w:p>
       <w:pPr>
         <w:spacing w:before="0" w:after="0"/>
       </w:pPr>
       <w:r>
+        <w:rPr>
+          <w:b/>
+        </w:rPr>
+        <w:t>Актор:</w:t>
+      </w:r>
+      <w:r>
         <w:rPr/>
-        <w:t>1) Застосунок зчитує QR-код на столику.</w:t>
+        <w:t xml:space="preserve"> клієнт (Mobile, камера). </w:t>
+      </w:r>
+      <w:r>
+        <w:rPr>
+          <w:b/>
+        </w:rPr>
+        <w:t>Передумови:</w:t>
+      </w:r>
+      <w:r>
+        <w:rPr/>
+        <w:t xml:space="preserve"> підтверджене бронювання на цей столик або вільний столик. </w:t>
+      </w:r>
+      <w:r>
+        <w:rPr>
+          <w:b/>
+        </w:rPr>
+        <w:t>Тригер:</w:t>
+      </w:r>
+      <w:r>
+        <w:rPr/>
+        <w:t xml:space="preserve"> клієнт сканує QR-код на столику.</w:t>
       </w:r>
     </w:p>
     <w:p>
@@ -3279,7 +3396,7 @@
       </w:pPr>
       <w:r>
         <w:rPr/>
-        <w:t>2) Система знаходить підтверджене бронювання клієнта і перевіряє, що це саме цей столик і настав час візиту.</w:t>
+        <w:t>Основний сценарій:</w:t>
       </w:r>
     </w:p>
     <w:p>
@@ -3288,7 +3405,7 @@
       </w:pPr>
       <w:r>
         <w:rPr/>
-        <w:t>3) Статус бронювання змінюється на «Гість у ресторані», відкривається меню для замовлення.</w:t>
+        <w:t>1) Застосунок зчитує QR-код і надсилає його на сервер.</w:t>
       </w:r>
     </w:p>
     <w:p>
@@ -3297,7 +3414,41 @@
       </w:pPr>
       <w:r>
         <w:rPr/>
-        <w:t>Альтернативи: якщо бронювання немає, а столик вільний, система пропонує сісти без бронювання (walk-in). Винятки: чужий столик, занадто рано або невідомий QR-код — зрозуміле повідомлення про помилку.</w:t>
+        <w:t>2) Система знаходить підтверджене бронювання клієнта і перевіряє, що це саме цей столик і настав час візиту.</w:t>
+      </w:r>
+    </w:p>
+    <w:p>
+      <w:pPr>
+        <w:spacing w:before="0" w:after="0"/>
+      </w:pPr>
+      <w:r>
+        <w:rPr/>
+        <w:t>3) Статус бронювання змінюється на «Гість у ресторані», відкривається меню для замовлення.</w:t>
+      </w:r>
+    </w:p>
+    <w:p>
+      <w:pPr>
+        <w:spacing w:before="0" w:after="0"/>
+      </w:pPr>
+      <w:r>
+        <w:rPr>
+          <w:b/>
+        </w:rPr>
+        <w:t>Альтернативні сценарії та винятки:</w:t>
+      </w:r>
+      <w:r>
+        <w:rPr/>
+        <w:t xml:space="preserve"> якщо бронювання немає, а столик вільний, система пропонує сісти без бронювання (walk-in); чужий столик, занадто ранній прихід або невідомий QR-код — зрозуміле повідомлення з кодом помилки. </w:t>
+      </w:r>
+      <w:r>
+        <w:rPr>
+          <w:b/>
+        </w:rPr>
+        <w:t>Постумови:</w:t>
+      </w:r>
+      <w:r>
+        <w:rPr/>
+        <w:t xml:space="preserve"> візит у статусі CHECKED_IN, столик на плані залу позначено зайнятим.</w:t>
       </w:r>
     </w:p>
     <w:p>
@@ -3310,16 +3461,56 @@
         </w:rPr>
         <w:t>UC-06 «Зробити замовлення в залі».</w:t>
       </w:r>
-      <w:r>
-        <w:rPr/>
-        <w:t xml:space="preserve"> Актор: клієнт або офіціант (POS). Передумови: візит у статусі «Гість у ресторані».</w:t>
-      </w:r>
     </w:p>
     <w:p>
       <w:pPr>
         <w:spacing w:before="0" w:after="0"/>
       </w:pPr>
       <w:r>
+        <w:rPr>
+          <w:b/>
+        </w:rPr>
+        <w:t>Актор:</w:t>
+      </w:r>
+      <w:r>
+        <w:rPr/>
+        <w:t xml:space="preserve"> клієнт або офіціант (POS). </w:t>
+      </w:r>
+      <w:r>
+        <w:rPr>
+          <w:b/>
+        </w:rPr>
+        <w:t>Передумови:</w:t>
+      </w:r>
+      <w:r>
+        <w:rPr/>
+        <w:t xml:space="preserve"> візит у статусі «Гість у ресторані». </w:t>
+      </w:r>
+      <w:r>
+        <w:rPr>
+          <w:b/>
+        </w:rPr>
+        <w:t>Тригер:</w:t>
+      </w:r>
+      <w:r>
+        <w:rPr/>
+        <w:t xml:space="preserve"> клієнт надсилає кошик.</w:t>
+      </w:r>
+    </w:p>
+    <w:p>
+      <w:pPr>
+        <w:spacing w:before="0" w:after="0"/>
+      </w:pPr>
+      <w:r>
+        <w:rPr/>
+        <w:t>Основний сценарій:</w:t>
+      </w:r>
+    </w:p>
+    <w:p>
+      <w:pPr>
+        <w:spacing w:before="0" w:after="0"/>
+      </w:pPr>
+      <w:r>
         <w:rPr/>
         <w:t>1) Клієнт додає страви в кошик і бачить рекомендації.</w:t>
       </w:r>
@@ -3347,8 +3538,24 @@
         <w:spacing w:before="0" w:after="0"/>
       </w:pPr>
       <w:r>
+        <w:rPr>
+          <w:b/>
+        </w:rPr>
+        <w:t>Альтернативні сценарії та винятки:</w:t>
+      </w:r>
+      <w:r>
         <w:rPr/>
-        <w:t>Альтернативи: замовлення офіціанта (POS) одразу потрапляє на кухню.</w:t>
+        <w:t xml:space="preserve"> замовлення офіціанта (POS) одразу потрапляє на кухню; без check-in — 409 NOT_CHECKED_IN; страва в стоп-листі — 409 DISH_UNAVAILABLE. </w:t>
+      </w:r>
+      <w:r>
+        <w:rPr>
+          <w:b/>
+        </w:rPr>
+        <w:t>Постумови:</w:t>
+      </w:r>
+      <w:r>
+        <w:rPr/>
+        <w:t xml:space="preserve"> замовлення та позиції збережено, подія order:created надіслана залу.</w:t>
       </w:r>
     </w:p>
     <w:p>
@@ -3361,18 +3568,40 @@
         </w:rPr>
         <w:t>UC-15 «Готувати замовлення».</w:t>
       </w:r>
-      <w:r>
-        <w:rPr/>
-        <w:t xml:space="preserve"> Актор: кухар. Передумови: замовлення залу прийняте офіціантом або замовлення на доставку оплачене.</w:t>
-      </w:r>
     </w:p>
     <w:p>
       <w:pPr>
         <w:spacing w:before="0" w:after="0"/>
       </w:pPr>
       <w:r>
+        <w:rPr>
+          <w:b/>
+        </w:rPr>
+        <w:t>Актор:</w:t>
+      </w:r>
+      <w:r>
         <w:rPr/>
-        <w:t>1) Кухар бачить новий тікет (звуковий сигнал); замовлення на доставку мають позначку «Доставка».</w:t>
+        <w:t xml:space="preserve"> кухар. </w:t>
+      </w:r>
+      <w:r>
+        <w:rPr>
+          <w:b/>
+        </w:rPr>
+        <w:t>Передумови:</w:t>
+      </w:r>
+      <w:r>
+        <w:rPr/>
+        <w:t xml:space="preserve"> замовлення залу прийняте офіціантом або замовлення на доставку оплачене. </w:t>
+      </w:r>
+      <w:r>
+        <w:rPr>
+          <w:b/>
+        </w:rPr>
+        <w:t>Тригер:</w:t>
+      </w:r>
+      <w:r>
+        <w:rPr/>
+        <w:t xml:space="preserve"> новий тікет на kitchen display (звуковий сигнал).</w:t>
       </w:r>
     </w:p>
     <w:p>
@@ -3381,7 +3610,7 @@
       </w:pPr>
       <w:r>
         <w:rPr/>
-        <w:t>2) «Почати готувати» — статус «Готується».</w:t>
+        <w:t>Основний сценарій:</w:t>
       </w:r>
     </w:p>
     <w:p>
@@ -3390,7 +3619,7 @@
       </w:pPr>
       <w:r>
         <w:rPr/>
-        <w:t>3) Кухар відмічає страви; коли готові всі, замовлення автоматично переходить у «Готово».</w:t>
+        <w:t>1) Кухар натискає «Почати готувати» — статус «Готується».</w:t>
       </w:r>
     </w:p>
     <w:p>
@@ -3399,7 +3628,7 @@
       </w:pPr>
       <w:r>
         <w:rPr/>
-        <w:t>4) Офіціант або курʼєр отримують сигнал, клієнт — сповіщення.</w:t>
+        <w:t>2) Кухар відмічає страви; коли готові всі, замовлення автоматично переходить у «Готово».</w:t>
       </w:r>
     </w:p>
     <w:p>
@@ -3408,7 +3637,32 @@
       </w:pPr>
       <w:r>
         <w:rPr/>
-        <w:t>Винятки: офіціант не може перевести замовлення в «Готується», а кухар — подати страву.</w:t>
+        <w:t>3) Офіціант або курʼєр отримують сигнал, клієнт — сповіщення.</w:t>
+      </w:r>
+    </w:p>
+    <w:p>
+      <w:pPr>
+        <w:spacing w:before="0" w:after="0"/>
+      </w:pPr>
+      <w:r>
+        <w:rPr>
+          <w:b/>
+        </w:rPr>
+        <w:t>Альтернативні сценарії та винятки:</w:t>
+      </w:r>
+      <w:r>
+        <w:rPr/>
+        <w:t xml:space="preserve"> замовлення на доставку мають позначку «Доставка» й район; офіціант не може перевести замовлення в «Готується», а кухар — подати страву (403). </w:t>
+      </w:r>
+      <w:r>
+        <w:rPr>
+          <w:b/>
+        </w:rPr>
+        <w:t>Постумови:</w:t>
+      </w:r>
+      <w:r>
+        <w:rPr/>
+        <w:t xml:space="preserve"> статус READY, зафіксовано час приготування для аналітики.</w:t>
       </w:r>
     </w:p>
     <w:p>
@@ -3421,46 +3675,6 @@
         </w:rPr>
         <w:t>UC-08 «Оплатити замовлення».</w:t>
       </w:r>
-      <w:r>
-        <w:rPr/>
-        <w:t xml:space="preserve"> Актор: клієнт, платіжний шлюз (sandbox). Передумови: замовлення в залі подане або замовлення на доставку щойно оформлене з оплатою карткою.</w:t>
-      </w:r>
-    </w:p>
-    <w:p>
-      <w:pPr>
-        <w:spacing w:before="0" w:after="0"/>
-      </w:pPr>
-      <w:r>
-        <w:rPr/>
-        <w:t>1) Клієнт вводить дані картки й обирає чайові.</w:t>
-      </w:r>
-    </w:p>
-    <w:p>
-      <w:pPr>
-        <w:spacing w:before="0" w:after="0"/>
-      </w:pPr>
-      <w:r>
-        <w:rPr/>
-        <w:t>2) Сервер перевіряє картку (алгоритм Луна, термін дії, CVC), шлюз авторизує платіж.</w:t>
-      </w:r>
-    </w:p>
-    <w:p>
-      <w:pPr>
-        <w:spacing w:before="0" w:after="0"/>
-      </w:pPr>
-      <w:r>
-        <w:rPr/>
-        <w:t>3) В одній транзакції фіксуються успішний платіж і новий статус замовлення.</w:t>
-      </w:r>
-    </w:p>
-    <w:p>
-      <w:pPr>
-        <w:spacing w:before="0" w:after="0"/>
-      </w:pPr>
-      <w:r>
-        <w:rPr/>
-        <w:t>Альтернативи: банк вимагає 3-D Secure — клієнт вводить код; повторне натискання «Оплатити» не створює другий платіж. Результат: рівно один успішний платіж на замовлення; повний номер картки не зберігається.</w:t>
-      </w:r>
     </w:p>
     <w:p>
       <w:pPr>
@@ -3470,71 +3684,31 @@
         <w:rPr>
           <w:b/>
         </w:rPr>
-        <w:t>UC-D01 «Оформити доставку».</w:t>
+        <w:t>Актор:</w:t>
       </w:r>
       <w:r>
         <w:rPr/>
-        <w:t xml:space="preserve"> Актор: клієнт (Mobile). Передумови: доставка працює (до закриття кухні лишилося більше 45 хв), у клієнта менше трьох активних доставок.</w:t>
-      </w:r>
-    </w:p>
-    <w:p>
-      <w:pPr>
-        <w:spacing w:before="0" w:after="0"/>
-      </w:pPr>
-      <w:r>
-        <w:rPr/>
-        <w:t>1) Клієнт формує кошик і обирає збережену або нову адресу; система визначає зону доставки.</w:t>
-      </w:r>
-    </w:p>
-    <w:p>
-      <w:pPr>
-        <w:spacing w:before="0" w:after="0"/>
-      </w:pPr>
-      <w:r>
-        <w:rPr/>
-        <w:t>2) Система показує суму, тариф доставки (або «безкоштовно» від порогу), мінімальну суму та очікуваний час: черга кухні + приготування + 5 хв на передачу + час у дорозі для зони.</w:t>
-      </w:r>
-    </w:p>
-    <w:p>
-      <w:pPr>
-        <w:spacing w:before="0" w:after="0"/>
-      </w:pPr>
-      <w:r>
-        <w:rPr/>
-        <w:t>3) Клієнт вказує отримувача й телефон, обирає оплату карткою або готівкою курʼєру.</w:t>
-      </w:r>
-    </w:p>
-    <w:p>
-      <w:pPr>
-        <w:spacing w:before="0" w:after="0"/>
-      </w:pPr>
-      <w:r>
-        <w:rPr/>
-        <w:t>4) Карткою: замовлення чекає на оплату (UC-08) і після успішного платежу потрапляє на кухню. Готівкою: замовлення одразу йде на кухню.</w:t>
-      </w:r>
-    </w:p>
-    <w:p>
-      <w:pPr>
-        <w:spacing w:before="0" w:after="0"/>
-      </w:pPr>
-      <w:r>
-        <w:rPr/>
-        <w:t>Винятки: сума менша за мінімальну для зони, зона не обслуговується, неправильний телефон, доставка закрита. Неоплачене замовлення автоматично скасовується через 15 хв.</w:t>
-      </w:r>
-    </w:p>
-    <w:p>
-      <w:pPr>
-        <w:spacing w:before="0" w:after="0"/>
-      </w:pPr>
+        <w:t xml:space="preserve"> клієнт, платіжний шлюз (sandbox). </w:t>
+      </w:r>
       <w:r>
         <w:rPr>
           <w:b/>
         </w:rPr>
-        <w:t>UC-R03 «Доставити замовлення».</w:t>
+        <w:t>Передумови:</w:t>
       </w:r>
       <w:r>
         <w:rPr/>
-        <w:t xml:space="preserve"> Актор: курʼєр (Mobile). Передумови: курʼєр має менше двох активних доставок.</w:t>
+        <w:t xml:space="preserve"> замовлення в залі подане або замовлення на доставку оформлене з оплатою карткою. </w:t>
+      </w:r>
+      <w:r>
+        <w:rPr>
+          <w:b/>
+        </w:rPr>
+        <w:t>Тригер:</w:t>
+      </w:r>
+      <w:r>
+        <w:rPr/>
+        <w:t xml:space="preserve"> клієнт натискає «Оплатити».</w:t>
       </w:r>
     </w:p>
     <w:p>
@@ -3543,7 +3717,7 @@
       </w:pPr>
       <w:r>
         <w:rPr/>
-        <w:t>1) Курʼєр бачить нове замовлення в черзі (сповіщення) і бере його; інші курʼєри більше не бачать цього замовлення.</w:t>
+        <w:t>Основний сценарій:</w:t>
       </w:r>
     </w:p>
     <w:p>
@@ -3552,7 +3726,7 @@
       </w:pPr>
       <w:r>
         <w:rPr/>
-        <w:t>2) Коли кухня позначила «Готово», курʼєр натискає «Забрав замовлення» — статус «В дорозі», клієнт отримує сповіщення.</w:t>
+        <w:t>1) Клієнт вводить дані картки й обирає чайові.</w:t>
       </w:r>
     </w:p>
     <w:p>
@@ -3561,7 +3735,7 @@
       </w:pPr>
       <w:r>
         <w:rPr/>
-        <w:t>3) Курʼєр відкриває маршрут або дзвонить клієнту одним натисканням.</w:t>
+        <w:t>2) Сервер перевіряє картку (алгоритм Луна, термін дії, CVC), шлюз авторизує платіж.</w:t>
       </w:r>
     </w:p>
     <w:p>
@@ -3570,7 +3744,7 @@
       </w:pPr>
       <w:r>
         <w:rPr/>
-        <w:t>4) Після вручення курʼєр натискає «Вручено» — статус «Доставлено»; для готівки фіксується отримана сума.</w:t>
+        <w:t>3) В одній транзакції фіксуються успішний платіж і новий статус замовлення.</w:t>
       </w:r>
     </w:p>
     <w:p>
@@ -3578,16 +3752,35 @@
         <w:spacing w:before="0" w:after="0"/>
       </w:pPr>
       <w:r>
+        <w:rPr>
+          <w:b/>
+        </w:rPr>
+        <w:t>Альтернативні сценарії та винятки:</w:t>
+      </w:r>
+      <w:r>
         <w:rPr/>
-        <w:t>Альтернативи: до виїзду курʼєр може відмовитися від замовлення, і воно повертається в загальну чергу; диспетчер може призначити іншого курʼєра. Винятки: забрати замовлення, яке ще готується, неможливо.</w:t>
+        <w:t xml:space="preserve"> банк вимагає 3-D Secure — клієнт вводить код; повторне натискання «Оплатити» з тим самим ключем ідемпотентності не створює другий платіж; відмова банку — 402. </w:t>
+      </w:r>
+      <w:r>
+        <w:rPr>
+          <w:b/>
+        </w:rPr>
+        <w:t>Постумови:</w:t>
+      </w:r>
+      <w:r>
+        <w:rPr/>
+        <w:t xml:space="preserve"> рівно один успішний платіж на замовлення; повний номер картки не зберігається.</w:t>
       </w:r>
     </w:p>
     <w:p>
       <w:pPr>
-        <w:pStyle w:val="Heading2"/>
-      </w:pPr>
-      <w:r>
-        <w:t>1.3 Постановка задачі</w:t>
+        <w:spacing w:before="0" w:after="0"/>
+      </w:pPr>
+      <w:r>
+        <w:rPr>
+          <w:b/>
+        </w:rPr>
+        <w:t>UC-22 «Оформити доставку».</w:t>
       </w:r>
     </w:p>
     <w:p>
@@ -3595,6 +3788,226 @@
         <w:spacing w:before="0" w:after="0"/>
       </w:pPr>
       <w:r>
+        <w:rPr>
+          <w:b/>
+        </w:rPr>
+        <w:t>Актор:</w:t>
+      </w:r>
+      <w:r>
+        <w:rPr/>
+        <w:t xml:space="preserve"> клієнт (Mobile). </w:t>
+      </w:r>
+      <w:r>
+        <w:rPr>
+          <w:b/>
+        </w:rPr>
+        <w:t>Передумови:</w:t>
+      </w:r>
+      <w:r>
+        <w:rPr/>
+        <w:t xml:space="preserve"> доставка працює (до закриття кухні лишилося більше 45 хв), у клієнта менше трьох активних доставок. </w:t>
+      </w:r>
+      <w:r>
+        <w:rPr>
+          <w:b/>
+        </w:rPr>
+        <w:t>Тригер:</w:t>
+      </w:r>
+      <w:r>
+        <w:rPr/>
+        <w:t xml:space="preserve"> клієнт натискає «Оформити доставку» в кошику.</w:t>
+      </w:r>
+    </w:p>
+    <w:p>
+      <w:pPr>
+        <w:spacing w:before="0" w:after="0"/>
+      </w:pPr>
+      <w:r>
+        <w:rPr/>
+        <w:t>Основний сценарій:</w:t>
+      </w:r>
+    </w:p>
+    <w:p>
+      <w:pPr>
+        <w:spacing w:before="0" w:after="0"/>
+      </w:pPr>
+      <w:r>
+        <w:rPr/>
+        <w:t>1) Клієнт обирає збережену або нову адресу; система визначає зону доставки.</w:t>
+      </w:r>
+    </w:p>
+    <w:p>
+      <w:pPr>
+        <w:spacing w:before="0" w:after="0"/>
+      </w:pPr>
+      <w:r>
+        <w:rPr/>
+        <w:t>2) Система показує суму, тариф доставки (або «безкоштовно» від порогу), мінімальну суму та очікуваний час.</w:t>
+      </w:r>
+    </w:p>
+    <w:p>
+      <w:pPr>
+        <w:spacing w:before="0" w:after="0"/>
+      </w:pPr>
+      <w:r>
+        <w:rPr/>
+        <w:t>3) Клієнт вказує отримувача й телефон, обирає оплату карткою або готівкою курʼєру.</w:t>
+      </w:r>
+    </w:p>
+    <w:p>
+      <w:pPr>
+        <w:spacing w:before="0" w:after="0"/>
+      </w:pPr>
+      <w:r>
+        <w:rPr/>
+        <w:t>4) Карткою: замовлення чекає на оплату (UC-08) і після успішного платежу потрапляє на кухню. Готівкою: замовлення одразу йде на кухню.</w:t>
+      </w:r>
+    </w:p>
+    <w:p>
+      <w:pPr>
+        <w:spacing w:before="0" w:after="0"/>
+      </w:pPr>
+      <w:r>
+        <w:rPr>
+          <w:b/>
+        </w:rPr>
+        <w:t>Альтернативні сценарії та винятки:</w:t>
+      </w:r>
+      <w:r>
+        <w:rPr/>
+        <w:t xml:space="preserve"> кнопка «Моє місцезнаходження» визначає район за GPS і підставляє вулицю й будинок; сума менша за мінімальну для зони, зона не обслуговується, неправильний телефон або доставка закрита — помилка з поясненням; неоплачене замовлення автоматично скасовується через 15 хв. </w:t>
+      </w:r>
+      <w:r>
+        <w:rPr>
+          <w:b/>
+        </w:rPr>
+        <w:t>Постумови:</w:t>
+      </w:r>
+      <w:r>
+        <w:rPr/>
+        <w:t xml:space="preserve"> у базі даних створено замовлення типу DELIVERY і запис доставки зі знімком адреси; кухня отримала тікет.</w:t>
+      </w:r>
+    </w:p>
+    <w:p>
+      <w:pPr>
+        <w:spacing w:before="0" w:after="0"/>
+      </w:pPr>
+      <w:r>
+        <w:rPr>
+          <w:b/>
+        </w:rPr>
+        <w:t>UC-25 «Доставити замовлення».</w:t>
+      </w:r>
+    </w:p>
+    <w:p>
+      <w:pPr>
+        <w:spacing w:before="0" w:after="0"/>
+      </w:pPr>
+      <w:r>
+        <w:rPr>
+          <w:b/>
+        </w:rPr>
+        <w:t>Актор:</w:t>
+      </w:r>
+      <w:r>
+        <w:rPr/>
+        <w:t xml:space="preserve"> курʼєр (Mobile). </w:t>
+      </w:r>
+      <w:r>
+        <w:rPr>
+          <w:b/>
+        </w:rPr>
+        <w:t>Передумови:</w:t>
+      </w:r>
+      <w:r>
+        <w:rPr/>
+        <w:t xml:space="preserve"> курʼєр прийняв замовлення (UC-24) і має не більше двох активних доставок. </w:t>
+      </w:r>
+      <w:r>
+        <w:rPr>
+          <w:b/>
+        </w:rPr>
+        <w:t>Тригер:</w:t>
+      </w:r>
+      <w:r>
+        <w:rPr/>
+        <w:t xml:space="preserve"> кухня позначила замовлення «Готово».</w:t>
+      </w:r>
+    </w:p>
+    <w:p>
+      <w:pPr>
+        <w:spacing w:before="0" w:after="0"/>
+      </w:pPr>
+      <w:r>
+        <w:rPr/>
+        <w:t>Основний сценарій:</w:t>
+      </w:r>
+    </w:p>
+    <w:p>
+      <w:pPr>
+        <w:spacing w:before="0" w:after="0"/>
+      </w:pPr>
+      <w:r>
+        <w:rPr/>
+        <w:t>1) Курʼєр отримує сповіщення і натискає «Забрав замовлення» — статус «В дорозі», клієнт отримує сповіщення.</w:t>
+      </w:r>
+    </w:p>
+    <w:p>
+      <w:pPr>
+        <w:spacing w:before="0" w:after="0"/>
+      </w:pPr>
+      <w:r>
+        <w:rPr/>
+        <w:t>2) Курʼєр відкриває маршрут або дзвонить клієнту одним натисканням.</w:t>
+      </w:r>
+    </w:p>
+    <w:p>
+      <w:pPr>
+        <w:spacing w:before="0" w:after="0"/>
+      </w:pPr>
+      <w:r>
+        <w:rPr/>
+        <w:t>3) Після вручення курʼєр натискає «Вручено» — статус «Доставлено»; для готівки фіксується отримана сума.</w:t>
+      </w:r>
+    </w:p>
+    <w:p>
+      <w:pPr>
+        <w:spacing w:before="0" w:after="0"/>
+      </w:pPr>
+      <w:r>
+        <w:rPr>
+          <w:b/>
+        </w:rPr>
+        <w:t>Альтернативні сценарії та винятки:</w:t>
+      </w:r>
+      <w:r>
+        <w:rPr/>
+        <w:t xml:space="preserve"> до виїзду курʼєр може відмовитися від замовлення, і воно повертається в загальну чергу; диспетчер може призначити іншого курʼєра; забрати замовлення, яке ще готується, неможливо (409 NOT_READY). </w:t>
+      </w:r>
+      <w:r>
+        <w:rPr>
+          <w:b/>
+        </w:rPr>
+        <w:t>Постумови:</w:t>
+      </w:r>
+      <w:r>
+        <w:rPr/>
+        <w:t xml:space="preserve"> заповнено час виїзду й вручення, оновлено підсумки зміни курʼєра й аналітику доставки.</w:t>
+      </w:r>
+    </w:p>
+    <w:p>
+      <w:pPr>
+        <w:pStyle w:val="Heading2"/>
+      </w:pPr>
+      <w:r>
+        <w:t>1.3 Постановка задачі</w:t>
+      </w:r>
+    </w:p>
+    <w:p>
+      <w:pPr>
+        <w:spacing w:before="0" w:after="0"/>
+      </w:pPr>
+      <w:r>
         <w:rPr/>
         <w:t>На основі аналізу поставлено завдання: розробити систему SMART RESTAURANT із Web- і Mobile-клієнтами, двома серверними системами (Restaurant API для залу та Delivery API для доставки) і єдиною базою даних PostgreSQL. Система автоматизує процес «бронювання → підтвердження → check-in → замовлення → приготування → готовність → оплата» та процес «оформлення доставки → оплата → кухня → курʼєр → доставлено» для пʼяти ролей.</w:t>
       </w:r>
@@ -3605,7 +4018,7 @@
       </w:pPr>
       <w:r>
         <w:rPr/>
-        <w:t>Вимоги методички виконуються: система не є лише меню чи доставкою — доставка доповнює основний процес обслуговування в залі; є Web і нативний Mobile, автентифікація з ролями, бізнес-логіка зі станами та двостороння інтеграція Web ↔ Mobile через спільну базу даних.</w:t>
+        <w:t>Web-застосунок призначений насамперед для персоналу (робоче місце залу, kitchen display, адміністрування) і для гостей, які бронюють із компʼютера. Mobile-застосунок — основний інструмент гостя (бронювання, QR check-in камерою, замовлення, оплата, доставка з геолокацією) і курʼєра, а також мобільне робоче місце персоналу.</w:t>
       </w:r>
     </w:p>
     <w:p>
@@ -3614,24 +4027,33 @@
       </w:pPr>
       <w:r>
         <w:rPr/>
-        <w:t>Критерій захисту: створити бронювання і провести замовлення через повний цикл, а також оформити доставку в мобільному застосунку і провести її до статусу «Доставлено» з боку курʼєра.</w:t>
+        <w:t>Вимоги методички виконуються: система не є лише меню чи доставкою — доставка доповнює основний процес обслуговування в залі; є Web і нативний Mobile, автентифікація з ролями, бізнес-логіка зі станами та двостороння інтеграція Web ↔ Mobile через спільну базу даних.</w:t>
       </w:r>
     </w:p>
     <w:p>
       <w:pPr>
-        <w:pStyle w:val="Heading3"/>
-      </w:pPr>
-      <w:r>
-        <w:t>1.3.1 Матриця функціональності</w:t>
+        <w:spacing w:before="0" w:after="0"/>
+      </w:pPr>
+      <w:r>
+        <w:rPr/>
+        <w:t>Критерій захисту: створити бронювання і провести замовлення через повний цикл, а також оформити доставку в мобільному застосунку і провести її до статусу «Доставлено» з боку курʼєра.</w:t>
       </w:r>
     </w:p>
     <w:p>
       <w:pPr>
+        <w:pStyle w:val="Heading3"/>
+      </w:pPr>
+      <w:r>
+        <w:t>1.3.1 Матриця функціональності</w:t>
+      </w:r>
+    </w:p>
+    <w:p>
+      <w:pPr>
         <w:spacing w:before="0" w:after="0"/>
       </w:pPr>
       <w:r>
         <w:rPr/>
-        <w:t>Матриця функціональності (табл. 1.2) показує, у якому клієнті доступна кожна функція і яка серверна система її обслуговує. Web-застосунок працює лише з Restaurant API; мобільний застосунок — з обома системами.</w:t>
+        <w:t>Матриця функціональності (табл. 1.2) визначає погоджений обсяг системи: у якому клієнті доступна кожна функція, через яке API вона працює, з якими даними і на якому етапі реалізується. Web-застосунок працює з Restaurant API; мобільний застосунок — з обома системами.</w:t>
       </w:r>
     </w:p>
     <w:p>
@@ -3677,11 +4099,13 @@
         <w:tblLook w:firstColumn="1" w:firstRow="1" w:lastColumn="0" w:lastRow="0" w:noHBand="0" w:noVBand="1" w:val="04A0"/>
       </w:tblPr>
       <w:tblGrid>
-        <w:gridCol w:w="2844"/>
-        <w:gridCol w:w="2352"/>
-        <w:gridCol w:w="656"/>
-        <w:gridCol w:w="1353"/>
-        <w:gridCol w:w="2148"/>
+        <w:gridCol w:w="2184"/>
+        <w:gridCol w:w="1170"/>
+        <w:gridCol w:w="601"/>
+        <w:gridCol w:w="1361"/>
+        <w:gridCol w:w="1243"/>
+        <w:gridCol w:w="1922"/>
+        <w:gridCol w:w="871"/>
       </w:tblGrid>
       <w:tr>
         <w:trPr>
@@ -3690,7 +4114,7 @@
         </w:trPr>
         <w:tc>
           <w:tcPr>
-            <w:tcW w:type="dxa" w:w="2845"/>
+            <w:tcW w:type="dxa" w:w="2184"/>
           </w:tcPr>
           <w:p>
             <w:pPr>
@@ -3702,7 +4126,7 @@
             <w:r>
               <w:rPr>
                 <w:b/>
-                <w:sz w:val="24"/>
+                <w:sz w:val="22"/>
               </w:rPr>
               <w:t>Функція</w:t>
             </w:r>
@@ -3710,7 +4134,7 @@
         </w:tc>
         <w:tc>
           <w:tcPr>
-            <w:tcW w:type="dxa" w:w="2352"/>
+            <w:tcW w:type="dxa" w:w="1171"/>
           </w:tcPr>
           <w:p>
             <w:pPr>
@@ -3722,7 +4146,7 @@
             <w:r>
               <w:rPr>
                 <w:b/>
-                <w:sz w:val="24"/>
+                <w:sz w:val="22"/>
               </w:rPr>
               <w:t>Роль</w:t>
             </w:r>
@@ -3730,7 +4154,7 @@
         </w:tc>
         <w:tc>
           <w:tcPr>
-            <w:tcW w:type="dxa" w:w="656"/>
+            <w:tcW w:type="dxa" w:w="602"/>
           </w:tcPr>
           <w:p>
             <w:pPr>
@@ -3742,7 +4166,7 @@
             <w:r>
               <w:rPr>
                 <w:b/>
-                <w:sz w:val="24"/>
+                <w:sz w:val="22"/>
               </w:rPr>
               <w:t>Web</w:t>
             </w:r>
@@ -3750,7 +4174,7 @@
         </w:tc>
         <w:tc>
           <w:tcPr>
-            <w:tcW w:type="dxa" w:w="1354"/>
+            <w:tcW w:type="dxa" w:w="1361"/>
           </w:tcPr>
           <w:p>
             <w:pPr>
@@ -3762,7 +4186,7 @@
             <w:r>
               <w:rPr>
                 <w:b/>
-                <w:sz w:val="24"/>
+                <w:sz w:val="22"/>
               </w:rPr>
               <w:t>Mobile</w:t>
             </w:r>
@@ -3770,7 +4194,7 @@
         </w:tc>
         <w:tc>
           <w:tcPr>
-            <w:tcW w:type="dxa" w:w="2148"/>
+            <w:tcW w:type="dxa" w:w="1243"/>
           </w:tcPr>
           <w:p>
             <w:pPr>
@@ -3782,9 +4206,49 @@
             <w:r>
               <w:rPr>
                 <w:b/>
-                <w:sz w:val="24"/>
+                <w:sz w:val="22"/>
               </w:rPr>
-              <w:t>Система</w:t>
+              <w:t>API</w:t>
+            </w:r>
+          </w:p>
+        </w:tc>
+        <w:tc>
+          <w:tcPr>
+            <w:tcW w:type="dxa" w:w="1922"/>
+          </w:tcPr>
+          <w:p>
+            <w:pPr>
+              <w:keepNext/>
+              <w:spacing w:line="240" w:lineRule="auto"/>
+              <w:ind w:firstLine="0"/>
+              <w:jc w:val="center"/>
+            </w:pPr>
+            <w:r>
+              <w:rPr>
+                <w:b/>
+                <w:sz w:val="22"/>
+              </w:rPr>
+              <w:t>Основні дані БД</w:t>
+            </w:r>
+          </w:p>
+        </w:tc>
+        <w:tc>
+          <w:tcPr>
+            <w:tcW w:type="dxa" w:w="872"/>
+          </w:tcPr>
+          <w:p>
+            <w:pPr>
+              <w:keepNext/>
+              <w:spacing w:line="240" w:lineRule="auto"/>
+              <w:ind w:firstLine="0"/>
+              <w:jc w:val="center"/>
+            </w:pPr>
+            <w:r>
+              <w:rPr>
+                <w:b/>
+                <w:sz w:val="22"/>
+              </w:rPr>
+              <w:t>Етап</w:t>
             </w:r>
           </w:p>
         </w:tc>
@@ -3795,7 +4259,7 @@
         </w:trPr>
         <w:tc>
           <w:tcPr>
-            <w:tcW w:type="dxa" w:w="2845"/>
+            <w:tcW w:type="dxa" w:w="2184"/>
           </w:tcPr>
           <w:p>
             <w:pPr>
@@ -3806,15 +4270,15 @@
             </w:pPr>
             <w:r>
               <w:rPr>
-                <w:sz w:val="24"/>
+                <w:sz w:val="22"/>
               </w:rPr>
-              <w:t>Реєстрація / вхід (один для обох систем)</w:t>
+              <w:t>Реєстрація / вхід</w:t>
             </w:r>
           </w:p>
         </w:tc>
         <w:tc>
           <w:tcPr>
-            <w:tcW w:type="dxa" w:w="2352"/>
+            <w:tcW w:type="dxa" w:w="1171"/>
           </w:tcPr>
           <w:p>
             <w:pPr>
@@ -3825,7 +4289,7 @@
             </w:pPr>
             <w:r>
               <w:rPr>
-                <w:sz w:val="24"/>
+                <w:sz w:val="22"/>
               </w:rPr>
               <w:t>усі</w:t>
             </w:r>
@@ -3833,7 +4297,26 @@
         </w:tc>
         <w:tc>
           <w:tcPr>
-            <w:tcW w:type="dxa" w:w="656"/>
+            <w:tcW w:type="dxa" w:w="602"/>
+          </w:tcPr>
+          <w:p>
+            <w:pPr>
+              <w:keepNext/>
+              <w:spacing w:line="240" w:lineRule="auto"/>
+              <w:ind w:firstLine="0"/>
+              <w:jc w:val="center"/>
+            </w:pPr>
+            <w:r>
+              <w:rPr>
+                <w:sz w:val="22"/>
+              </w:rPr>
+              <w:t>✓</w:t>
+            </w:r>
+          </w:p>
+        </w:tc>
+        <w:tc>
+          <w:tcPr>
+            <w:tcW w:type="dxa" w:w="1361"/>
           </w:tcPr>
           <w:p>
             <w:pPr>
@@ -3844,7 +4327,7 @@
             </w:pPr>
             <w:r>
               <w:rPr>
-                <w:sz w:val="24"/>
+                <w:sz w:val="22"/>
               </w:rPr>
               <w:t>✓</w:t>
             </w:r>
@@ -3852,7 +4335,7 @@
         </w:tc>
         <w:tc>
           <w:tcPr>
-            <w:tcW w:type="dxa" w:w="1354"/>
+            <w:tcW w:type="dxa" w:w="1243"/>
           </w:tcPr>
           <w:p>
             <w:pPr>
@@ -3863,7 +4346,7 @@
             </w:pPr>
             <w:r>
               <w:rPr>
-                <w:sz w:val="24"/>
+                <w:sz w:val="22"/>
               </w:rPr>
               <w:t>✓</w:t>
             </w:r>
@@ -3871,7 +4354,7 @@
         </w:tc>
         <w:tc>
           <w:tcPr>
-            <w:tcW w:type="dxa" w:w="2148"/>
+            <w:tcW w:type="dxa" w:w="1922"/>
           </w:tcPr>
           <w:p>
             <w:pPr>
@@ -3882,9 +4365,28 @@
             </w:pPr>
             <w:r>
               <w:rPr>
-                <w:sz w:val="24"/>
+                <w:sz w:val="22"/>
               </w:rPr>
-              <w:t>Restaurant API</w:t>
+              <w:t>User, RefreshToken</w:t>
+            </w:r>
+          </w:p>
+        </w:tc>
+        <w:tc>
+          <w:tcPr>
+            <w:tcW w:type="dxa" w:w="872"/>
+          </w:tcPr>
+          <w:p>
+            <w:pPr>
+              <w:keepNext/>
+              <w:spacing w:line="240" w:lineRule="auto"/>
+              <w:ind w:firstLine="0"/>
+              <w:jc w:val="left"/>
+            </w:pPr>
+            <w:r>
+              <w:rPr>
+                <w:sz w:val="22"/>
+              </w:rPr>
+              <w:t>КТ2</w:t>
             </w:r>
           </w:p>
         </w:tc>
@@ -3895,7 +4397,7 @@
         </w:trPr>
         <w:tc>
           <w:tcPr>
-            <w:tcW w:type="dxa" w:w="2845"/>
+            <w:tcW w:type="dxa" w:w="2184"/>
           </w:tcPr>
           <w:p>
             <w:pPr>
@@ -3906,7 +4408,7 @@
             </w:pPr>
             <w:r>
               <w:rPr>
-                <w:sz w:val="24"/>
+                <w:sz w:val="22"/>
               </w:rPr>
               <w:t>Меню, пошук, рекомендації</w:t>
             </w:r>
@@ -3914,7 +4416,7 @@
         </w:tc>
         <w:tc>
           <w:tcPr>
-            <w:tcW w:type="dxa" w:w="2352"/>
+            <w:tcW w:type="dxa" w:w="1171"/>
           </w:tcPr>
           <w:p>
             <w:pPr>
@@ -3925,15 +4427,34 @@
             </w:pPr>
             <w:r>
               <w:rPr>
-                <w:sz w:val="24"/>
+                <w:sz w:val="22"/>
               </w:rPr>
-              <w:t>клієнт</w:t>
+              <w:t>Client</w:t>
             </w:r>
           </w:p>
         </w:tc>
         <w:tc>
           <w:tcPr>
-            <w:tcW w:type="dxa" w:w="656"/>
+            <w:tcW w:type="dxa" w:w="602"/>
+          </w:tcPr>
+          <w:p>
+            <w:pPr>
+              <w:keepNext/>
+              <w:spacing w:line="240" w:lineRule="auto"/>
+              <w:ind w:firstLine="0"/>
+              <w:jc w:val="center"/>
+            </w:pPr>
+            <w:r>
+              <w:rPr>
+                <w:sz w:val="22"/>
+              </w:rPr>
+              <w:t>✓</w:t>
+            </w:r>
+          </w:p>
+        </w:tc>
+        <w:tc>
+          <w:tcPr>
+            <w:tcW w:type="dxa" w:w="1361"/>
           </w:tcPr>
           <w:p>
             <w:pPr>
@@ -3944,7 +4465,7 @@
             </w:pPr>
             <w:r>
               <w:rPr>
-                <w:sz w:val="24"/>
+                <w:sz w:val="22"/>
               </w:rPr>
               <w:t>✓</w:t>
             </w:r>
@@ -3952,7 +4473,7 @@
         </w:tc>
         <w:tc>
           <w:tcPr>
-            <w:tcW w:type="dxa" w:w="1354"/>
+            <w:tcW w:type="dxa" w:w="1243"/>
           </w:tcPr>
           <w:p>
             <w:pPr>
@@ -3963,7 +4484,7 @@
             </w:pPr>
             <w:r>
               <w:rPr>
-                <w:sz w:val="24"/>
+                <w:sz w:val="22"/>
               </w:rPr>
               <w:t>✓</w:t>
             </w:r>
@@ -3971,7 +4492,7 @@
         </w:tc>
         <w:tc>
           <w:tcPr>
-            <w:tcW w:type="dxa" w:w="2148"/>
+            <w:tcW w:type="dxa" w:w="1922"/>
           </w:tcPr>
           <w:p>
             <w:pPr>
@@ -3982,9 +4503,28 @@
             </w:pPr>
             <w:r>
               <w:rPr>
-                <w:sz w:val="24"/>
+                <w:sz w:val="22"/>
               </w:rPr>
-              <w:t>Restaurant API</w:t>
+              <w:t>Dish, Category, Review</w:t>
+            </w:r>
+          </w:p>
+        </w:tc>
+        <w:tc>
+          <w:tcPr>
+            <w:tcW w:type="dxa" w:w="872"/>
+          </w:tcPr>
+          <w:p>
+            <w:pPr>
+              <w:keepNext/>
+              <w:spacing w:line="240" w:lineRule="auto"/>
+              <w:ind w:firstLine="0"/>
+              <w:jc w:val="left"/>
+            </w:pPr>
+            <w:r>
+              <w:rPr>
+                <w:sz w:val="22"/>
+              </w:rPr>
+              <w:t>КТ2</w:t>
             </w:r>
           </w:p>
         </w:tc>
@@ -3995,7 +4535,7 @@
         </w:trPr>
         <w:tc>
           <w:tcPr>
-            <w:tcW w:type="dxa" w:w="2845"/>
+            <w:tcW w:type="dxa" w:w="2184"/>
           </w:tcPr>
           <w:p>
             <w:pPr>
@@ -4006,15 +4546,15 @@
             </w:pPr>
             <w:r>
               <w:rPr>
-                <w:sz w:val="24"/>
+                <w:sz w:val="22"/>
               </w:rPr>
-              <w:t>Бронювання, слоти, план залу</w:t>
+              <w:t>Слоти, бронювання</w:t>
             </w:r>
           </w:p>
         </w:tc>
         <w:tc>
           <w:tcPr>
-            <w:tcW w:type="dxa" w:w="2352"/>
+            <w:tcW w:type="dxa" w:w="1171"/>
           </w:tcPr>
           <w:p>
             <w:pPr>
@@ -4025,15 +4565,34 @@
             </w:pPr>
             <w:r>
               <w:rPr>
-                <w:sz w:val="24"/>
+                <w:sz w:val="22"/>
               </w:rPr>
-              <w:t>клієнт, працівник</w:t>
+              <w:t>Client, Staff</w:t>
             </w:r>
           </w:p>
         </w:tc>
         <w:tc>
           <w:tcPr>
-            <w:tcW w:type="dxa" w:w="656"/>
+            <w:tcW w:type="dxa" w:w="602"/>
+          </w:tcPr>
+          <w:p>
+            <w:pPr>
+              <w:keepNext/>
+              <w:spacing w:line="240" w:lineRule="auto"/>
+              <w:ind w:firstLine="0"/>
+              <w:jc w:val="center"/>
+            </w:pPr>
+            <w:r>
+              <w:rPr>
+                <w:sz w:val="22"/>
+              </w:rPr>
+              <w:t>✓</w:t>
+            </w:r>
+          </w:p>
+        </w:tc>
+        <w:tc>
+          <w:tcPr>
+            <w:tcW w:type="dxa" w:w="1361"/>
           </w:tcPr>
           <w:p>
             <w:pPr>
@@ -4044,7 +4603,7 @@
             </w:pPr>
             <w:r>
               <w:rPr>
-                <w:sz w:val="24"/>
+                <w:sz w:val="22"/>
               </w:rPr>
               <w:t>✓</w:t>
             </w:r>
@@ -4052,7 +4611,7 @@
         </w:tc>
         <w:tc>
           <w:tcPr>
-            <w:tcW w:type="dxa" w:w="1354"/>
+            <w:tcW w:type="dxa" w:w="1243"/>
           </w:tcPr>
           <w:p>
             <w:pPr>
@@ -4063,7 +4622,7 @@
             </w:pPr>
             <w:r>
               <w:rPr>
-                <w:sz w:val="24"/>
+                <w:sz w:val="22"/>
               </w:rPr>
               <w:t>✓</w:t>
             </w:r>
@@ -4071,7 +4630,7 @@
         </w:tc>
         <w:tc>
           <w:tcPr>
-            <w:tcW w:type="dxa" w:w="2148"/>
+            <w:tcW w:type="dxa" w:w="1922"/>
           </w:tcPr>
           <w:p>
             <w:pPr>
@@ -4082,9 +4641,28 @@
             </w:pPr>
             <w:r>
               <w:rPr>
-                <w:sz w:val="24"/>
+                <w:sz w:val="22"/>
               </w:rPr>
-              <w:t>Restaurant API</w:t>
+              <w:t>Table, Reservation</w:t>
+            </w:r>
+          </w:p>
+        </w:tc>
+        <w:tc>
+          <w:tcPr>
+            <w:tcW w:type="dxa" w:w="872"/>
+          </w:tcPr>
+          <w:p>
+            <w:pPr>
+              <w:keepNext/>
+              <w:spacing w:line="240" w:lineRule="auto"/>
+              <w:ind w:firstLine="0"/>
+              <w:jc w:val="left"/>
+            </w:pPr>
+            <w:r>
+              <w:rPr>
+                <w:sz w:val="22"/>
+              </w:rPr>
+              <w:t>КТ2/3</w:t>
             </w:r>
           </w:p>
         </w:tc>
@@ -4095,7 +4673,7 @@
         </w:trPr>
         <w:tc>
           <w:tcPr>
-            <w:tcW w:type="dxa" w:w="2845"/>
+            <w:tcW w:type="dxa" w:w="2184"/>
           </w:tcPr>
           <w:p>
             <w:pPr>
@@ -4106,15 +4684,15 @@
             </w:pPr>
             <w:r>
               <w:rPr>
-                <w:sz w:val="24"/>
+                <w:sz w:val="22"/>
               </w:rPr>
-              <w:t>QR check-in, walk-in</w:t>
+              <w:t>Підтвердження / відхилення</w:t>
             </w:r>
           </w:p>
         </w:tc>
         <w:tc>
           <w:tcPr>
-            <w:tcW w:type="dxa" w:w="2352"/>
+            <w:tcW w:type="dxa" w:w="1171"/>
           </w:tcPr>
           <w:p>
             <w:pPr>
@@ -4125,15 +4703,34 @@
             </w:pPr>
             <w:r>
               <w:rPr>
-                <w:sz w:val="24"/>
+                <w:sz w:val="22"/>
               </w:rPr>
-              <w:t>клієнт, працівник</w:t>
+              <w:t>Staff</w:t>
             </w:r>
           </w:p>
         </w:tc>
         <w:tc>
           <w:tcPr>
-            <w:tcW w:type="dxa" w:w="656"/>
+            <w:tcW w:type="dxa" w:w="602"/>
+          </w:tcPr>
+          <w:p>
+            <w:pPr>
+              <w:keepNext/>
+              <w:spacing w:line="240" w:lineRule="auto"/>
+              <w:ind w:firstLine="0"/>
+              <w:jc w:val="center"/>
+            </w:pPr>
+            <w:r>
+              <w:rPr>
+                <w:sz w:val="22"/>
+              </w:rPr>
+              <w:t>✓</w:t>
+            </w:r>
+          </w:p>
+        </w:tc>
+        <w:tc>
+          <w:tcPr>
+            <w:tcW w:type="dxa" w:w="1361"/>
           </w:tcPr>
           <w:p>
             <w:pPr>
@@ -4144,7 +4741,7 @@
             </w:pPr>
             <w:r>
               <w:rPr>
-                <w:sz w:val="24"/>
+                <w:sz w:val="22"/>
               </w:rPr>
               <w:t>✓</w:t>
             </w:r>
@@ -4152,7 +4749,7 @@
         </w:tc>
         <w:tc>
           <w:tcPr>
-            <w:tcW w:type="dxa" w:w="1354"/>
+            <w:tcW w:type="dxa" w:w="1243"/>
           </w:tcPr>
           <w:p>
             <w:pPr>
@@ -4163,15 +4760,15 @@
             </w:pPr>
             <w:r>
               <w:rPr>
-                <w:sz w:val="24"/>
+                <w:sz w:val="22"/>
               </w:rPr>
-              <w:t>✓ (камера)</w:t>
+              <w:t>✓</w:t>
             </w:r>
           </w:p>
         </w:tc>
         <w:tc>
           <w:tcPr>
-            <w:tcW w:type="dxa" w:w="2148"/>
+            <w:tcW w:type="dxa" w:w="1922"/>
           </w:tcPr>
           <w:p>
             <w:pPr>
@@ -4182,9 +4779,28 @@
             </w:pPr>
             <w:r>
               <w:rPr>
-                <w:sz w:val="24"/>
+                <w:sz w:val="22"/>
               </w:rPr>
-              <w:t>Restaurant API</w:t>
+              <w:t>Reservation, StatusChange</w:t>
+            </w:r>
+          </w:p>
+        </w:tc>
+        <w:tc>
+          <w:tcPr>
+            <w:tcW w:type="dxa" w:w="872"/>
+          </w:tcPr>
+          <w:p>
+            <w:pPr>
+              <w:keepNext/>
+              <w:spacing w:line="240" w:lineRule="auto"/>
+              <w:ind w:firstLine="0"/>
+              <w:jc w:val="left"/>
+            </w:pPr>
+            <w:r>
+              <w:rPr>
+                <w:sz w:val="22"/>
+              </w:rPr>
+              <w:t>КТ2</w:t>
             </w:r>
           </w:p>
         </w:tc>
@@ -4195,7 +4811,7 @@
         </w:trPr>
         <w:tc>
           <w:tcPr>
-            <w:tcW w:type="dxa" w:w="2845"/>
+            <w:tcW w:type="dxa" w:w="2184"/>
           </w:tcPr>
           <w:p>
             <w:pPr>
@@ -4206,15 +4822,15 @@
             </w:pPr>
             <w:r>
               <w:rPr>
-                <w:sz w:val="24"/>
+                <w:sz w:val="22"/>
               </w:rPr>
-              <w:t>Замовлення в залі, POS</w:t>
+              <w:t>QR check-in, walk-in</w:t>
             </w:r>
           </w:p>
         </w:tc>
         <w:tc>
           <w:tcPr>
-            <w:tcW w:type="dxa" w:w="2352"/>
+            <w:tcW w:type="dxa" w:w="1171"/>
           </w:tcPr>
           <w:p>
             <w:pPr>
@@ -4225,15 +4841,34 @@
             </w:pPr>
             <w:r>
               <w:rPr>
-                <w:sz w:val="24"/>
+                <w:sz w:val="22"/>
               </w:rPr>
-              <w:t>клієнт, працівник</w:t>
+              <w:t>Client, Staff</w:t>
             </w:r>
           </w:p>
         </w:tc>
         <w:tc>
           <w:tcPr>
-            <w:tcW w:type="dxa" w:w="656"/>
+            <w:tcW w:type="dxa" w:w="602"/>
+          </w:tcPr>
+          <w:p>
+            <w:pPr>
+              <w:keepNext/>
+              <w:spacing w:line="240" w:lineRule="auto"/>
+              <w:ind w:firstLine="0"/>
+              <w:jc w:val="center"/>
+            </w:pPr>
+            <w:r>
+              <w:rPr>
+                <w:sz w:val="22"/>
+              </w:rPr>
+              <w:t>✓</w:t>
+            </w:r>
+          </w:p>
+        </w:tc>
+        <w:tc>
+          <w:tcPr>
+            <w:tcW w:type="dxa" w:w="1361"/>
           </w:tcPr>
           <w:p>
             <w:pPr>
@@ -4244,15 +4879,15 @@
             </w:pPr>
             <w:r>
               <w:rPr>
-                <w:sz w:val="24"/>
+                <w:sz w:val="22"/>
               </w:rPr>
-              <w:t>✓</w:t>
+              <w:t>✓ (камера)</w:t>
             </w:r>
           </w:p>
         </w:tc>
         <w:tc>
           <w:tcPr>
-            <w:tcW w:type="dxa" w:w="1354"/>
+            <w:tcW w:type="dxa" w:w="1243"/>
           </w:tcPr>
           <w:p>
             <w:pPr>
@@ -4263,7 +4898,7 @@
             </w:pPr>
             <w:r>
               <w:rPr>
-                <w:sz w:val="24"/>
+                <w:sz w:val="22"/>
               </w:rPr>
               <w:t>✓</w:t>
             </w:r>
@@ -4271,7 +4906,7 @@
         </w:tc>
         <w:tc>
           <w:tcPr>
-            <w:tcW w:type="dxa" w:w="2148"/>
+            <w:tcW w:type="dxa" w:w="1922"/>
           </w:tcPr>
           <w:p>
             <w:pPr>
@@ -4282,9 +4917,28 @@
             </w:pPr>
             <w:r>
               <w:rPr>
-                <w:sz w:val="24"/>
+                <w:sz w:val="22"/>
               </w:rPr>
-              <w:t>Restaurant API</w:t>
+              <w:t>Table, Reservation</w:t>
+            </w:r>
+          </w:p>
+        </w:tc>
+        <w:tc>
+          <w:tcPr>
+            <w:tcW w:type="dxa" w:w="872"/>
+          </w:tcPr>
+          <w:p>
+            <w:pPr>
+              <w:keepNext/>
+              <w:spacing w:line="240" w:lineRule="auto"/>
+              <w:ind w:firstLine="0"/>
+              <w:jc w:val="left"/>
+            </w:pPr>
+            <w:r>
+              <w:rPr>
+                <w:sz w:val="22"/>
+              </w:rPr>
+              <w:t>КТ3</w:t>
             </w:r>
           </w:p>
         </w:tc>
@@ -4295,7 +4949,7 @@
         </w:trPr>
         <w:tc>
           <w:tcPr>
-            <w:tcW w:type="dxa" w:w="2845"/>
+            <w:tcW w:type="dxa" w:w="2184"/>
           </w:tcPr>
           <w:p>
             <w:pPr>
@@ -4306,15 +4960,15 @@
             </w:pPr>
             <w:r>
               <w:rPr>
-                <w:sz w:val="24"/>
+                <w:sz w:val="22"/>
               </w:rPr>
-              <w:t>Kitchen display (зал і доставка)</w:t>
+              <w:t>Замовлення в залі, POS</w:t>
             </w:r>
           </w:p>
         </w:tc>
         <w:tc>
           <w:tcPr>
-            <w:tcW w:type="dxa" w:w="2352"/>
+            <w:tcW w:type="dxa" w:w="1171"/>
           </w:tcPr>
           <w:p>
             <w:pPr>
@@ -4325,15 +4979,34 @@
             </w:pPr>
             <w:r>
               <w:rPr>
-                <w:sz w:val="24"/>
+                <w:sz w:val="22"/>
               </w:rPr>
-              <w:t>кухар</w:t>
+              <w:t>Client, Staff</w:t>
             </w:r>
           </w:p>
         </w:tc>
         <w:tc>
           <w:tcPr>
-            <w:tcW w:type="dxa" w:w="656"/>
+            <w:tcW w:type="dxa" w:w="602"/>
+          </w:tcPr>
+          <w:p>
+            <w:pPr>
+              <w:keepNext/>
+              <w:spacing w:line="240" w:lineRule="auto"/>
+              <w:ind w:firstLine="0"/>
+              <w:jc w:val="center"/>
+            </w:pPr>
+            <w:r>
+              <w:rPr>
+                <w:sz w:val="22"/>
+              </w:rPr>
+              <w:t>✓</w:t>
+            </w:r>
+          </w:p>
+        </w:tc>
+        <w:tc>
+          <w:tcPr>
+            <w:tcW w:type="dxa" w:w="1361"/>
           </w:tcPr>
           <w:p>
             <w:pPr>
@@ -4344,7 +5017,7 @@
             </w:pPr>
             <w:r>
               <w:rPr>
-                <w:sz w:val="24"/>
+                <w:sz w:val="22"/>
               </w:rPr>
               <w:t>✓</w:t>
             </w:r>
@@ -4352,7 +5025,7 @@
         </w:tc>
         <w:tc>
           <w:tcPr>
-            <w:tcW w:type="dxa" w:w="1354"/>
+            <w:tcW w:type="dxa" w:w="1243"/>
           </w:tcPr>
           <w:p>
             <w:pPr>
@@ -4363,7 +5036,7 @@
             </w:pPr>
             <w:r>
               <w:rPr>
-                <w:sz w:val="24"/>
+                <w:sz w:val="22"/>
               </w:rPr>
               <w:t>✓</w:t>
             </w:r>
@@ -4371,7 +5044,7 @@
         </w:tc>
         <w:tc>
           <w:tcPr>
-            <w:tcW w:type="dxa" w:w="2148"/>
+            <w:tcW w:type="dxa" w:w="1922"/>
           </w:tcPr>
           <w:p>
             <w:pPr>
@@ -4382,9 +5055,28 @@
             </w:pPr>
             <w:r>
               <w:rPr>
-                <w:sz w:val="24"/>
+                <w:sz w:val="22"/>
               </w:rPr>
-              <w:t>Restaurant API</w:t>
+              <w:t>Order, OrderItem</w:t>
+            </w:r>
+          </w:p>
+        </w:tc>
+        <w:tc>
+          <w:tcPr>
+            <w:tcW w:type="dxa" w:w="872"/>
+          </w:tcPr>
+          <w:p>
+            <w:pPr>
+              <w:keepNext/>
+              <w:spacing w:line="240" w:lineRule="auto"/>
+              <w:ind w:firstLine="0"/>
+              <w:jc w:val="left"/>
+            </w:pPr>
+            <w:r>
+              <w:rPr>
+                <w:sz w:val="22"/>
+              </w:rPr>
+              <w:t>КТ2/3</w:t>
             </w:r>
           </w:p>
         </w:tc>
@@ -4395,7 +5087,7 @@
         </w:trPr>
         <w:tc>
           <w:tcPr>
-            <w:tcW w:type="dxa" w:w="2845"/>
+            <w:tcW w:type="dxa" w:w="2184"/>
           </w:tcPr>
           <w:p>
             <w:pPr>
@@ -4406,15 +5098,15 @@
             </w:pPr>
             <w:r>
               <w:rPr>
-                <w:sz w:val="24"/>
+                <w:sz w:val="22"/>
               </w:rPr>
-              <w:t>Оплата в залі, відгуки</w:t>
+              <w:t>Kitchen display</w:t>
             </w:r>
           </w:p>
         </w:tc>
         <w:tc>
           <w:tcPr>
-            <w:tcW w:type="dxa" w:w="2352"/>
+            <w:tcW w:type="dxa" w:w="1171"/>
           </w:tcPr>
           <w:p>
             <w:pPr>
@@ -4425,15 +5117,34 @@
             </w:pPr>
             <w:r>
               <w:rPr>
-                <w:sz w:val="24"/>
+                <w:sz w:val="22"/>
               </w:rPr>
-              <w:t>клієнт, працівник</w:t>
+              <w:t>Kitchen</w:t>
             </w:r>
           </w:p>
         </w:tc>
         <w:tc>
           <w:tcPr>
-            <w:tcW w:type="dxa" w:w="656"/>
+            <w:tcW w:type="dxa" w:w="602"/>
+          </w:tcPr>
+          <w:p>
+            <w:pPr>
+              <w:keepNext/>
+              <w:spacing w:line="240" w:lineRule="auto"/>
+              <w:ind w:firstLine="0"/>
+              <w:jc w:val="center"/>
+            </w:pPr>
+            <w:r>
+              <w:rPr>
+                <w:sz w:val="22"/>
+              </w:rPr>
+              <w:t>✓</w:t>
+            </w:r>
+          </w:p>
+        </w:tc>
+        <w:tc>
+          <w:tcPr>
+            <w:tcW w:type="dxa" w:w="1361"/>
           </w:tcPr>
           <w:p>
             <w:pPr>
@@ -4444,7 +5155,7 @@
             </w:pPr>
             <w:r>
               <w:rPr>
-                <w:sz w:val="24"/>
+                <w:sz w:val="22"/>
               </w:rPr>
               <w:t>✓</w:t>
             </w:r>
@@ -4452,7 +5163,7 @@
         </w:tc>
         <w:tc>
           <w:tcPr>
-            <w:tcW w:type="dxa" w:w="1354"/>
+            <w:tcW w:type="dxa" w:w="1243"/>
           </w:tcPr>
           <w:p>
             <w:pPr>
@@ -4463,7 +5174,7 @@
             </w:pPr>
             <w:r>
               <w:rPr>
-                <w:sz w:val="24"/>
+                <w:sz w:val="22"/>
               </w:rPr>
               <w:t>✓</w:t>
             </w:r>
@@ -4471,7 +5182,7 @@
         </w:tc>
         <w:tc>
           <w:tcPr>
-            <w:tcW w:type="dxa" w:w="2148"/>
+            <w:tcW w:type="dxa" w:w="1922"/>
           </w:tcPr>
           <w:p>
             <w:pPr>
@@ -4482,9 +5193,28 @@
             </w:pPr>
             <w:r>
               <w:rPr>
-                <w:sz w:val="24"/>
+                <w:sz w:val="22"/>
               </w:rPr>
-              <w:t>Restaurant API</w:t>
+              <w:t>Order, OrderItem</w:t>
+            </w:r>
+          </w:p>
+        </w:tc>
+        <w:tc>
+          <w:tcPr>
+            <w:tcW w:type="dxa" w:w="872"/>
+          </w:tcPr>
+          <w:p>
+            <w:pPr>
+              <w:keepNext/>
+              <w:spacing w:line="240" w:lineRule="auto"/>
+              <w:ind w:firstLine="0"/>
+              <w:jc w:val="left"/>
+            </w:pPr>
+            <w:r>
+              <w:rPr>
+                <w:sz w:val="22"/>
+              </w:rPr>
+              <w:t>КТ3</w:t>
             </w:r>
           </w:p>
         </w:tc>
@@ -4495,7 +5225,7 @@
         </w:trPr>
         <w:tc>
           <w:tcPr>
-            <w:tcW w:type="dxa" w:w="2845"/>
+            <w:tcW w:type="dxa" w:w="2184"/>
           </w:tcPr>
           <w:p>
             <w:pPr>
@@ -4506,15 +5236,15 @@
             </w:pPr>
             <w:r>
               <w:rPr>
-                <w:sz w:val="24"/>
+                <w:sz w:val="22"/>
               </w:rPr>
-              <w:t>Меню, столики, користувачі</w:t>
+              <w:t>Статуси в реальному часі</w:t>
             </w:r>
           </w:p>
         </w:tc>
         <w:tc>
           <w:tcPr>
-            <w:tcW w:type="dxa" w:w="2352"/>
+            <w:tcW w:type="dxa" w:w="1171"/>
           </w:tcPr>
           <w:p>
             <w:pPr>
@@ -4525,15 +5255,34 @@
             </w:pPr>
             <w:r>
               <w:rPr>
-                <w:sz w:val="24"/>
+                <w:sz w:val="22"/>
               </w:rPr>
-              <w:t>адміністратор</w:t>
+              <w:t>усі</w:t>
             </w:r>
           </w:p>
         </w:tc>
         <w:tc>
           <w:tcPr>
-            <w:tcW w:type="dxa" w:w="656"/>
+            <w:tcW w:type="dxa" w:w="602"/>
+          </w:tcPr>
+          <w:p>
+            <w:pPr>
+              <w:keepNext/>
+              <w:spacing w:line="240" w:lineRule="auto"/>
+              <w:ind w:firstLine="0"/>
+              <w:jc w:val="center"/>
+            </w:pPr>
+            <w:r>
+              <w:rPr>
+                <w:sz w:val="22"/>
+              </w:rPr>
+              <w:t>✓</w:t>
+            </w:r>
+          </w:p>
+        </w:tc>
+        <w:tc>
+          <w:tcPr>
+            <w:tcW w:type="dxa" w:w="1361"/>
           </w:tcPr>
           <w:p>
             <w:pPr>
@@ -4544,7 +5293,7 @@
             </w:pPr>
             <w:r>
               <w:rPr>
-                <w:sz w:val="24"/>
+                <w:sz w:val="22"/>
               </w:rPr>
               <w:t>✓</w:t>
             </w:r>
@@ -4552,7 +5301,7 @@
         </w:tc>
         <w:tc>
           <w:tcPr>
-            <w:tcW w:type="dxa" w:w="1354"/>
+            <w:tcW w:type="dxa" w:w="1243"/>
           </w:tcPr>
           <w:p>
             <w:pPr>
@@ -4563,15 +5312,15 @@
             </w:pPr>
             <w:r>
               <w:rPr>
-                <w:sz w:val="24"/>
+                <w:sz w:val="22"/>
               </w:rPr>
-              <w:t>частково</w:t>
+              <w:t>WS</w:t>
             </w:r>
           </w:p>
         </w:tc>
         <w:tc>
           <w:tcPr>
-            <w:tcW w:type="dxa" w:w="2148"/>
+            <w:tcW w:type="dxa" w:w="1922"/>
           </w:tcPr>
           <w:p>
             <w:pPr>
@@ -4582,9 +5331,28 @@
             </w:pPr>
             <w:r>
               <w:rPr>
-                <w:sz w:val="24"/>
+                <w:sz w:val="22"/>
               </w:rPr>
-              <w:t>Restaurant API</w:t>
+              <w:t>Order, Reservation</w:t>
+            </w:r>
+          </w:p>
+        </w:tc>
+        <w:tc>
+          <w:tcPr>
+            <w:tcW w:type="dxa" w:w="872"/>
+          </w:tcPr>
+          <w:p>
+            <w:pPr>
+              <w:keepNext/>
+              <w:spacing w:line="240" w:lineRule="auto"/>
+              <w:ind w:firstLine="0"/>
+              <w:jc w:val="left"/>
+            </w:pPr>
+            <w:r>
+              <w:rPr>
+                <w:sz w:val="22"/>
+              </w:rPr>
+              <w:t>КТ3</w:t>
             </w:r>
           </w:p>
         </w:tc>
@@ -4595,7 +5363,7 @@
         </w:trPr>
         <w:tc>
           <w:tcPr>
-            <w:tcW w:type="dxa" w:w="2845"/>
+            <w:tcW w:type="dxa" w:w="2184"/>
           </w:tcPr>
           <w:p>
             <w:pPr>
@@ -4606,15 +5374,15 @@
             </w:pPr>
             <w:r>
               <w:rPr>
-                <w:sz w:val="24"/>
+                <w:sz w:val="22"/>
               </w:rPr>
-              <w:t>Аналітика (зал і доставка)</w:t>
+              <w:t>Оплата, відгуки</w:t>
             </w:r>
           </w:p>
         </w:tc>
         <w:tc>
           <w:tcPr>
-            <w:tcW w:type="dxa" w:w="2352"/>
+            <w:tcW w:type="dxa" w:w="1171"/>
           </w:tcPr>
           <w:p>
             <w:pPr>
@@ -4625,15 +5393,34 @@
             </w:pPr>
             <w:r>
               <w:rPr>
-                <w:sz w:val="24"/>
+                <w:sz w:val="22"/>
               </w:rPr>
-              <w:t>адміністратор</w:t>
+              <w:t>Client, Staff</w:t>
             </w:r>
           </w:p>
         </w:tc>
         <w:tc>
           <w:tcPr>
-            <w:tcW w:type="dxa" w:w="656"/>
+            <w:tcW w:type="dxa" w:w="602"/>
+          </w:tcPr>
+          <w:p>
+            <w:pPr>
+              <w:keepNext/>
+              <w:spacing w:line="240" w:lineRule="auto"/>
+              <w:ind w:firstLine="0"/>
+              <w:jc w:val="center"/>
+            </w:pPr>
+            <w:r>
+              <w:rPr>
+                <w:sz w:val="22"/>
+              </w:rPr>
+              <w:t>✓</w:t>
+            </w:r>
+          </w:p>
+        </w:tc>
+        <w:tc>
+          <w:tcPr>
+            <w:tcW w:type="dxa" w:w="1361"/>
           </w:tcPr>
           <w:p>
             <w:pPr>
@@ -4644,7 +5431,7 @@
             </w:pPr>
             <w:r>
               <w:rPr>
-                <w:sz w:val="24"/>
+                <w:sz w:val="22"/>
               </w:rPr>
               <w:t>✓</w:t>
             </w:r>
@@ -4652,7 +5439,7 @@
         </w:tc>
         <w:tc>
           <w:tcPr>
-            <w:tcW w:type="dxa" w:w="1354"/>
+            <w:tcW w:type="dxa" w:w="1243"/>
           </w:tcPr>
           <w:p>
             <w:pPr>
@@ -4663,7 +5450,7 @@
             </w:pPr>
             <w:r>
               <w:rPr>
-                <w:sz w:val="24"/>
+                <w:sz w:val="22"/>
               </w:rPr>
               <w:t>✓</w:t>
             </w:r>
@@ -4671,7 +5458,7 @@
         </w:tc>
         <w:tc>
           <w:tcPr>
-            <w:tcW w:type="dxa" w:w="2148"/>
+            <w:tcW w:type="dxa" w:w="1922"/>
           </w:tcPr>
           <w:p>
             <w:pPr>
@@ -4682,9 +5469,28 @@
             </w:pPr>
             <w:r>
               <w:rPr>
-                <w:sz w:val="24"/>
+                <w:sz w:val="22"/>
               </w:rPr>
-              <w:t>Restaurant API</w:t>
+              <w:t>Payment, Review</w:t>
+            </w:r>
+          </w:p>
+        </w:tc>
+        <w:tc>
+          <w:tcPr>
+            <w:tcW w:type="dxa" w:w="872"/>
+          </w:tcPr>
+          <w:p>
+            <w:pPr>
+              <w:keepNext/>
+              <w:spacing w:line="240" w:lineRule="auto"/>
+              <w:ind w:firstLine="0"/>
+              <w:jc w:val="left"/>
+            </w:pPr>
+            <w:r>
+              <w:rPr>
+                <w:sz w:val="22"/>
+              </w:rPr>
+              <w:t>КТ3</w:t>
             </w:r>
           </w:p>
         </w:tc>
@@ -4695,7 +5501,7 @@
         </w:trPr>
         <w:tc>
           <w:tcPr>
-            <w:tcW w:type="dxa" w:w="2845"/>
+            <w:tcW w:type="dxa" w:w="2184"/>
           </w:tcPr>
           <w:p>
             <w:pPr>
@@ -4706,15 +5512,15 @@
             </w:pPr>
             <w:r>
               <w:rPr>
-                <w:sz w:val="24"/>
+                <w:sz w:val="22"/>
               </w:rPr>
-              <w:t>Зони доставки, адреси, розрахунок</w:t>
+              <w:t>Меню, столики, користувачі</w:t>
             </w:r>
           </w:p>
         </w:tc>
         <w:tc>
           <w:tcPr>
-            <w:tcW w:type="dxa" w:w="2352"/>
+            <w:tcW w:type="dxa" w:w="1171"/>
           </w:tcPr>
           <w:p>
             <w:pPr>
@@ -4725,15 +5531,34 @@
             </w:pPr>
             <w:r>
               <w:rPr>
-                <w:sz w:val="24"/>
+                <w:sz w:val="22"/>
               </w:rPr>
-              <w:t>клієнт, адміністратор</w:t>
+              <w:t>Admin</w:t>
             </w:r>
           </w:p>
         </w:tc>
         <w:tc>
           <w:tcPr>
-            <w:tcW w:type="dxa" w:w="656"/>
+            <w:tcW w:type="dxa" w:w="602"/>
+          </w:tcPr>
+          <w:p>
+            <w:pPr>
+              <w:keepNext/>
+              <w:spacing w:line="240" w:lineRule="auto"/>
+              <w:ind w:firstLine="0"/>
+              <w:jc w:val="center"/>
+            </w:pPr>
+            <w:r>
+              <w:rPr>
+                <w:sz w:val="22"/>
+              </w:rPr>
+              <w:t>✓</w:t>
+            </w:r>
+          </w:p>
+        </w:tc>
+        <w:tc>
+          <w:tcPr>
+            <w:tcW w:type="dxa" w:w="1361"/>
           </w:tcPr>
           <w:p>
             <w:pPr>
@@ -4744,15 +5569,15 @@
             </w:pPr>
             <w:r>
               <w:rPr>
-                <w:sz w:val="24"/>
+                <w:sz w:val="22"/>
               </w:rPr>
-              <w:t>–</w:t>
+              <w:t>частково</w:t>
             </w:r>
           </w:p>
         </w:tc>
         <w:tc>
           <w:tcPr>
-            <w:tcW w:type="dxa" w:w="1354"/>
+            <w:tcW w:type="dxa" w:w="1243"/>
           </w:tcPr>
           <w:p>
             <w:pPr>
@@ -4763,7 +5588,7 @@
             </w:pPr>
             <w:r>
               <w:rPr>
-                <w:sz w:val="24"/>
+                <w:sz w:val="22"/>
               </w:rPr>
               <w:t>✓</w:t>
             </w:r>
@@ -4771,7 +5596,7 @@
         </w:tc>
         <w:tc>
           <w:tcPr>
-            <w:tcW w:type="dxa" w:w="2148"/>
+            <w:tcW w:type="dxa" w:w="1922"/>
           </w:tcPr>
           <w:p>
             <w:pPr>
@@ -4782,9 +5607,28 @@
             </w:pPr>
             <w:r>
               <w:rPr>
-                <w:sz w:val="24"/>
+                <w:sz w:val="22"/>
               </w:rPr>
-              <w:t>Delivery API</w:t>
+              <w:t>Dish, Table, User</w:t>
+            </w:r>
+          </w:p>
+        </w:tc>
+        <w:tc>
+          <w:tcPr>
+            <w:tcW w:type="dxa" w:w="872"/>
+          </w:tcPr>
+          <w:p>
+            <w:pPr>
+              <w:keepNext/>
+              <w:spacing w:line="240" w:lineRule="auto"/>
+              <w:ind w:firstLine="0"/>
+              <w:jc w:val="left"/>
+            </w:pPr>
+            <w:r>
+              <w:rPr>
+                <w:sz w:val="22"/>
+              </w:rPr>
+              <w:t>КТ2</w:t>
             </w:r>
           </w:p>
         </w:tc>
@@ -4795,7 +5639,7 @@
         </w:trPr>
         <w:tc>
           <w:tcPr>
-            <w:tcW w:type="dxa" w:w="2845"/>
+            <w:tcW w:type="dxa" w:w="2184"/>
           </w:tcPr>
           <w:p>
             <w:pPr>
@@ -4806,15 +5650,15 @@
             </w:pPr>
             <w:r>
               <w:rPr>
-                <w:sz w:val="24"/>
+                <w:sz w:val="22"/>
               </w:rPr>
-              <w:t>Оформлення й оплата доставки</w:t>
+              <w:t>Аналітика</w:t>
             </w:r>
           </w:p>
         </w:tc>
         <w:tc>
           <w:tcPr>
-            <w:tcW w:type="dxa" w:w="2352"/>
+            <w:tcW w:type="dxa" w:w="1171"/>
           </w:tcPr>
           <w:p>
             <w:pPr>
@@ -4825,15 +5669,34 @@
             </w:pPr>
             <w:r>
               <w:rPr>
-                <w:sz w:val="24"/>
+                <w:sz w:val="22"/>
               </w:rPr>
-              <w:t>клієнт</w:t>
+              <w:t>Admin</w:t>
             </w:r>
           </w:p>
         </w:tc>
         <w:tc>
           <w:tcPr>
-            <w:tcW w:type="dxa" w:w="656"/>
+            <w:tcW w:type="dxa" w:w="602"/>
+          </w:tcPr>
+          <w:p>
+            <w:pPr>
+              <w:keepNext/>
+              <w:spacing w:line="240" w:lineRule="auto"/>
+              <w:ind w:firstLine="0"/>
+              <w:jc w:val="center"/>
+            </w:pPr>
+            <w:r>
+              <w:rPr>
+                <w:sz w:val="22"/>
+              </w:rPr>
+              <w:t>✓</w:t>
+            </w:r>
+          </w:p>
+        </w:tc>
+        <w:tc>
+          <w:tcPr>
+            <w:tcW w:type="dxa" w:w="1361"/>
           </w:tcPr>
           <w:p>
             <w:pPr>
@@ -4844,15 +5707,15 @@
             </w:pPr>
             <w:r>
               <w:rPr>
-                <w:sz w:val="24"/>
+                <w:sz w:val="22"/>
               </w:rPr>
-              <w:t>–</w:t>
+              <w:t>✓ (з блоком доставки)</w:t>
             </w:r>
           </w:p>
         </w:tc>
         <w:tc>
           <w:tcPr>
-            <w:tcW w:type="dxa" w:w="1354"/>
+            <w:tcW w:type="dxa" w:w="1243"/>
           </w:tcPr>
           <w:p>
             <w:pPr>
@@ -4863,7 +5726,7 @@
             </w:pPr>
             <w:r>
               <w:rPr>
-                <w:sz w:val="24"/>
+                <w:sz w:val="22"/>
               </w:rPr>
               <w:t>✓</w:t>
             </w:r>
@@ -4871,7 +5734,7 @@
         </w:tc>
         <w:tc>
           <w:tcPr>
-            <w:tcW w:type="dxa" w:w="2148"/>
+            <w:tcW w:type="dxa" w:w="1922"/>
           </w:tcPr>
           <w:p>
             <w:pPr>
@@ -4882,9 +5745,28 @@
             </w:pPr>
             <w:r>
               <w:rPr>
-                <w:sz w:val="24"/>
+                <w:sz w:val="22"/>
               </w:rPr>
-              <w:t>Delivery API</w:t>
+              <w:t>Payment, Order, Delivery</w:t>
+            </w:r>
+          </w:p>
+        </w:tc>
+        <w:tc>
+          <w:tcPr>
+            <w:tcW w:type="dxa" w:w="872"/>
+          </w:tcPr>
+          <w:p>
+            <w:pPr>
+              <w:keepNext/>
+              <w:spacing w:line="240" w:lineRule="auto"/>
+              <w:ind w:firstLine="0"/>
+              <w:jc w:val="left"/>
+            </w:pPr>
+            <w:r>
+              <w:rPr>
+                <w:sz w:val="22"/>
+              </w:rPr>
+              <w:t>КТ3</w:t>
             </w:r>
           </w:p>
         </w:tc>
@@ -4895,7 +5777,7 @@
         </w:trPr>
         <w:tc>
           <w:tcPr>
-            <w:tcW w:type="dxa" w:w="2845"/>
+            <w:tcW w:type="dxa" w:w="2184"/>
           </w:tcPr>
           <w:p>
             <w:pPr>
@@ -4906,15 +5788,15 @@
             </w:pPr>
             <w:r>
               <w:rPr>
-                <w:sz w:val="24"/>
+                <w:sz w:val="22"/>
               </w:rPr>
-              <w:t>Робоче місце курʼєра</w:t>
+              <w:t>Оформлення й оплата доставки</w:t>
             </w:r>
           </w:p>
         </w:tc>
         <w:tc>
           <w:tcPr>
-            <w:tcW w:type="dxa" w:w="2352"/>
+            <w:tcW w:type="dxa" w:w="1171"/>
           </w:tcPr>
           <w:p>
             <w:pPr>
@@ -4925,15 +5807,34 @@
             </w:pPr>
             <w:r>
               <w:rPr>
-                <w:sz w:val="24"/>
+                <w:sz w:val="22"/>
               </w:rPr>
-              <w:t>курʼєр</w:t>
+              <w:t>Client</w:t>
             </w:r>
           </w:p>
         </w:tc>
         <w:tc>
           <w:tcPr>
-            <w:tcW w:type="dxa" w:w="656"/>
+            <w:tcW w:type="dxa" w:w="602"/>
+          </w:tcPr>
+          <w:p>
+            <w:pPr>
+              <w:keepNext/>
+              <w:spacing w:line="240" w:lineRule="auto"/>
+              <w:ind w:firstLine="0"/>
+              <w:jc w:val="center"/>
+            </w:pPr>
+            <w:r>
+              <w:rPr>
+                <w:sz w:val="22"/>
+              </w:rPr>
+              <w:t>–</w:t>
+            </w:r>
+          </w:p>
+        </w:tc>
+        <w:tc>
+          <w:tcPr>
+            <w:tcW w:type="dxa" w:w="1361"/>
           </w:tcPr>
           <w:p>
             <w:pPr>
@@ -4944,15 +5845,15 @@
             </w:pPr>
             <w:r>
               <w:rPr>
-                <w:sz w:val="24"/>
+                <w:sz w:val="22"/>
               </w:rPr>
-              <w:t>–</w:t>
+              <w:t>✓</w:t>
             </w:r>
           </w:p>
         </w:tc>
         <w:tc>
           <w:tcPr>
-            <w:tcW w:type="dxa" w:w="1354"/>
+            <w:tcW w:type="dxa" w:w="1243"/>
           </w:tcPr>
           <w:p>
             <w:pPr>
@@ -4963,15 +5864,15 @@
             </w:pPr>
             <w:r>
               <w:rPr>
-                <w:sz w:val="24"/>
+                <w:sz w:val="22"/>
               </w:rPr>
-              <w:t>✓</w:t>
+              <w:t>Delivery API</w:t>
             </w:r>
           </w:p>
         </w:tc>
         <w:tc>
           <w:tcPr>
-            <w:tcW w:type="dxa" w:w="2148"/>
+            <w:tcW w:type="dxa" w:w="1922"/>
           </w:tcPr>
           <w:p>
             <w:pPr>
@@ -4982,9 +5883,28 @@
             </w:pPr>
             <w:r>
               <w:rPr>
-                <w:sz w:val="24"/>
+                <w:sz w:val="22"/>
               </w:rPr>
-              <w:t>Delivery API</w:t>
+              <w:t>Order, Delivery, Address, Payment</w:t>
+            </w:r>
+          </w:p>
+        </w:tc>
+        <w:tc>
+          <w:tcPr>
+            <w:tcW w:type="dxa" w:w="872"/>
+          </w:tcPr>
+          <w:p>
+            <w:pPr>
+              <w:keepNext/>
+              <w:spacing w:line="240" w:lineRule="auto"/>
+              <w:ind w:firstLine="0"/>
+              <w:jc w:val="left"/>
+            </w:pPr>
+            <w:r>
+              <w:rPr>
+                <w:sz w:val="22"/>
+              </w:rPr>
+              <w:t>КТ3</w:t>
             </w:r>
           </w:p>
         </w:tc>
@@ -4995,7 +5915,7 @@
         </w:trPr>
         <w:tc>
           <w:tcPr>
-            <w:tcW w:type="dxa" w:w="2845"/>
+            <w:tcW w:type="dxa" w:w="2184"/>
           </w:tcPr>
           <w:p>
             <w:pPr>
@@ -5006,15 +5926,15 @@
             </w:pPr>
             <w:r>
               <w:rPr>
-                <w:sz w:val="24"/>
+                <w:sz w:val="22"/>
               </w:rPr>
-              <w:t>Диспетчерська доставок</w:t>
+              <w:t>Геолокація: район за GPS</w:t>
             </w:r>
           </w:p>
         </w:tc>
         <w:tc>
           <w:tcPr>
-            <w:tcW w:type="dxa" w:w="2352"/>
+            <w:tcW w:type="dxa" w:w="1171"/>
           </w:tcPr>
           <w:p>
             <w:pPr>
@@ -5025,15 +5945,34 @@
             </w:pPr>
             <w:r>
               <w:rPr>
-                <w:sz w:val="24"/>
+                <w:sz w:val="22"/>
               </w:rPr>
-              <w:t>працівник, адміністратор</w:t>
+              <w:t>Client</w:t>
             </w:r>
           </w:p>
         </w:tc>
         <w:tc>
           <w:tcPr>
-            <w:tcW w:type="dxa" w:w="656"/>
+            <w:tcW w:type="dxa" w:w="602"/>
+          </w:tcPr>
+          <w:p>
+            <w:pPr>
+              <w:keepNext/>
+              <w:spacing w:line="240" w:lineRule="auto"/>
+              <w:ind w:firstLine="0"/>
+              <w:jc w:val="center"/>
+            </w:pPr>
+            <w:r>
+              <w:rPr>
+                <w:sz w:val="22"/>
+              </w:rPr>
+              <w:t>–</w:t>
+            </w:r>
+          </w:p>
+        </w:tc>
+        <w:tc>
+          <w:tcPr>
+            <w:tcW w:type="dxa" w:w="1361"/>
           </w:tcPr>
           <w:p>
             <w:pPr>
@@ -5044,15 +5983,15 @@
             </w:pPr>
             <w:r>
               <w:rPr>
-                <w:sz w:val="24"/>
+                <w:sz w:val="22"/>
               </w:rPr>
-              <w:t>–</w:t>
+              <w:t>✓ (GPS)</w:t>
             </w:r>
           </w:p>
         </w:tc>
         <w:tc>
           <w:tcPr>
-            <w:tcW w:type="dxa" w:w="1354"/>
+            <w:tcW w:type="dxa" w:w="1243"/>
           </w:tcPr>
           <w:p>
             <w:pPr>
@@ -5063,15 +6002,15 @@
             </w:pPr>
             <w:r>
               <w:rPr>
-                <w:sz w:val="24"/>
+                <w:sz w:val="22"/>
               </w:rPr>
-              <w:t>✓</w:t>
+              <w:t>Delivery API</w:t>
             </w:r>
           </w:p>
         </w:tc>
         <w:tc>
           <w:tcPr>
-            <w:tcW w:type="dxa" w:w="2148"/>
+            <w:tcW w:type="dxa" w:w="1922"/>
           </w:tcPr>
           <w:p>
             <w:pPr>
@@ -5082,9 +6021,28 @@
             </w:pPr>
             <w:r>
               <w:rPr>
-                <w:sz w:val="24"/>
+                <w:sz w:val="22"/>
               </w:rPr>
-              <w:t>Delivery API</w:t>
+              <w:t>DeliveryZone</w:t>
+            </w:r>
+          </w:p>
+        </w:tc>
+        <w:tc>
+          <w:tcPr>
+            <w:tcW w:type="dxa" w:w="872"/>
+          </w:tcPr>
+          <w:p>
+            <w:pPr>
+              <w:keepNext/>
+              <w:spacing w:line="240" w:lineRule="auto"/>
+              <w:ind w:firstLine="0"/>
+              <w:jc w:val="left"/>
+            </w:pPr>
+            <w:r>
+              <w:rPr>
+                <w:sz w:val="22"/>
+              </w:rPr>
+              <w:t>КТ3</w:t>
             </w:r>
           </w:p>
         </w:tc>
@@ -5095,7 +6053,145 @@
         </w:trPr>
         <w:tc>
           <w:tcPr>
-            <w:tcW w:type="dxa" w:w="2845"/>
+            <w:tcW w:type="dxa" w:w="2184"/>
+          </w:tcPr>
+          <w:p>
+            <w:pPr>
+              <w:keepNext/>
+              <w:spacing w:line="240" w:lineRule="auto"/>
+              <w:ind w:firstLine="0"/>
+              <w:jc w:val="left"/>
+            </w:pPr>
+            <w:r>
+              <w:rPr>
+                <w:sz w:val="22"/>
+              </w:rPr>
+              <w:t>Робоче місце курʼєра</w:t>
+            </w:r>
+          </w:p>
+        </w:tc>
+        <w:tc>
+          <w:tcPr>
+            <w:tcW w:type="dxa" w:w="1171"/>
+          </w:tcPr>
+          <w:p>
+            <w:pPr>
+              <w:keepNext/>
+              <w:spacing w:line="240" w:lineRule="auto"/>
+              <w:ind w:firstLine="0"/>
+              <w:jc w:val="left"/>
+            </w:pPr>
+            <w:r>
+              <w:rPr>
+                <w:sz w:val="22"/>
+              </w:rPr>
+              <w:t>Courier</w:t>
+            </w:r>
+          </w:p>
+        </w:tc>
+        <w:tc>
+          <w:tcPr>
+            <w:tcW w:type="dxa" w:w="602"/>
+          </w:tcPr>
+          <w:p>
+            <w:pPr>
+              <w:keepNext/>
+              <w:spacing w:line="240" w:lineRule="auto"/>
+              <w:ind w:firstLine="0"/>
+              <w:jc w:val="center"/>
+            </w:pPr>
+            <w:r>
+              <w:rPr>
+                <w:sz w:val="22"/>
+              </w:rPr>
+              <w:t>–</w:t>
+            </w:r>
+          </w:p>
+        </w:tc>
+        <w:tc>
+          <w:tcPr>
+            <w:tcW w:type="dxa" w:w="1361"/>
+          </w:tcPr>
+          <w:p>
+            <w:pPr>
+              <w:keepNext/>
+              <w:spacing w:line="240" w:lineRule="auto"/>
+              <w:ind w:firstLine="0"/>
+              <w:jc w:val="left"/>
+            </w:pPr>
+            <w:r>
+              <w:rPr>
+                <w:sz w:val="22"/>
+              </w:rPr>
+              <w:t>✓</w:t>
+            </w:r>
+          </w:p>
+        </w:tc>
+        <w:tc>
+          <w:tcPr>
+            <w:tcW w:type="dxa" w:w="1243"/>
+          </w:tcPr>
+          <w:p>
+            <w:pPr>
+              <w:keepNext/>
+              <w:spacing w:line="240" w:lineRule="auto"/>
+              <w:ind w:firstLine="0"/>
+              <w:jc w:val="left"/>
+            </w:pPr>
+            <w:r>
+              <w:rPr>
+                <w:sz w:val="22"/>
+              </w:rPr>
+              <w:t>Delivery API</w:t>
+            </w:r>
+          </w:p>
+        </w:tc>
+        <w:tc>
+          <w:tcPr>
+            <w:tcW w:type="dxa" w:w="1922"/>
+          </w:tcPr>
+          <w:p>
+            <w:pPr>
+              <w:keepNext/>
+              <w:spacing w:line="240" w:lineRule="auto"/>
+              <w:ind w:firstLine="0"/>
+              <w:jc w:val="left"/>
+            </w:pPr>
+            <w:r>
+              <w:rPr>
+                <w:sz w:val="22"/>
+              </w:rPr>
+              <w:t>Delivery, Payment</w:t>
+            </w:r>
+          </w:p>
+        </w:tc>
+        <w:tc>
+          <w:tcPr>
+            <w:tcW w:type="dxa" w:w="872"/>
+          </w:tcPr>
+          <w:p>
+            <w:pPr>
+              <w:keepNext/>
+              <w:spacing w:line="240" w:lineRule="auto"/>
+              <w:ind w:firstLine="0"/>
+              <w:jc w:val="left"/>
+            </w:pPr>
+            <w:r>
+              <w:rPr>
+                <w:sz w:val="22"/>
+              </w:rPr>
+              <w:t>КТ3</w:t>
+            </w:r>
+          </w:p>
+        </w:tc>
+      </w:tr>
+      <w:tr>
+        <w:trPr>
+          <w:cantSplit w:val="true"/>
+        </w:trPr>
+        <w:tc>
+          <w:tcPr>
+            <w:tcW w:type="dxa" w:w="2184"/>
           </w:tcPr>
           <w:p>
             <w:pPr>
@@ -5105,15 +6201,15 @@
             </w:pPr>
             <w:r>
               <w:rPr>
-                <w:sz w:val="24"/>
+                <w:sz w:val="22"/>
               </w:rPr>
-              <w:t>Статуси в реальному часі</w:t>
+              <w:t>Диспетчерська, зони доставки</w:t>
             </w:r>
           </w:p>
         </w:tc>
         <w:tc>
           <w:tcPr>
-            <w:tcW w:type="dxa" w:w="2352"/>
+            <w:tcW w:type="dxa" w:w="1171"/>
           </w:tcPr>
           <w:p>
             <w:pPr>
@@ -5123,15 +6219,33 @@
             </w:pPr>
             <w:r>
               <w:rPr>
-                <w:sz w:val="24"/>
+                <w:sz w:val="22"/>
               </w:rPr>
-              <w:t>усі</w:t>
+              <w:t>Staff, Admin</w:t>
             </w:r>
           </w:p>
         </w:tc>
         <w:tc>
           <w:tcPr>
-            <w:tcW w:type="dxa" w:w="656"/>
+            <w:tcW w:type="dxa" w:w="602"/>
+          </w:tcPr>
+          <w:p>
+            <w:pPr>
+              <w:spacing w:line="240" w:lineRule="auto"/>
+              <w:ind w:firstLine="0"/>
+              <w:jc w:val="center"/>
+            </w:pPr>
+            <w:r>
+              <w:rPr>
+                <w:sz w:val="22"/>
+              </w:rPr>
+              <w:t>–</w:t>
+            </w:r>
+          </w:p>
+        </w:tc>
+        <w:tc>
+          <w:tcPr>
+            <w:tcW w:type="dxa" w:w="1361"/>
           </w:tcPr>
           <w:p>
             <w:pPr>
@@ -5141,7 +6255,7 @@
             </w:pPr>
             <w:r>
               <w:rPr>
-                <w:sz w:val="24"/>
+                <w:sz w:val="22"/>
               </w:rPr>
               <w:t>✓</w:t>
             </w:r>
@@ -5149,7 +6263,7 @@
         </w:tc>
         <w:tc>
           <w:tcPr>
-            <w:tcW w:type="dxa" w:w="1354"/>
+            <w:tcW w:type="dxa" w:w="1243"/>
           </w:tcPr>
           <w:p>
             <w:pPr>
@@ -5159,15 +6273,15 @@
             </w:pPr>
             <w:r>
               <w:rPr>
-                <w:sz w:val="24"/>
+                <w:sz w:val="22"/>
               </w:rPr>
-              <w:t>✓</w:t>
+              <w:t>Delivery API</w:t>
             </w:r>
           </w:p>
         </w:tc>
         <w:tc>
           <w:tcPr>
-            <w:tcW w:type="dxa" w:w="2148"/>
+            <w:tcW w:type="dxa" w:w="1922"/>
           </w:tcPr>
           <w:p>
             <w:pPr>
@@ -5177,9 +6291,27 @@
             </w:pPr>
             <w:r>
               <w:rPr>
-                <w:sz w:val="24"/>
+                <w:sz w:val="22"/>
               </w:rPr>
-              <w:t>обидві (Socket.IO)</w:t>
+              <w:t>Delivery, DeliveryZone</w:t>
+            </w:r>
+          </w:p>
+        </w:tc>
+        <w:tc>
+          <w:tcPr>
+            <w:tcW w:type="dxa" w:w="872"/>
+          </w:tcPr>
+          <w:p>
+            <w:pPr>
+              <w:spacing w:line="240" w:lineRule="auto"/>
+              <w:ind w:firstLine="0"/>
+              <w:jc w:val="left"/>
+            </w:pPr>
+            <w:r>
+              <w:rPr>
+                <w:sz w:val="22"/>
+              </w:rPr>
+              <w:t>КТ3</w:t>
             </w:r>
           </w:p>
         </w:tc>
@@ -5280,7 +6412,7 @@
       </w:r>
       <w:r>
         <w:rPr/>
-        <w:t xml:space="preserve"> React Native (Expo SDK 57) [6], React Navigation 7, expo-camera, expo-notifications, expo-secure-store.</w:t>
+        <w:t xml:space="preserve"> React Native (Expo SDK 57) [6], React Navigation 7, expo-camera, expo-location, expo-notifications, expo-secure-store.</w:t>
       </w:r>
     </w:p>
     <w:p>
@@ -5295,11 +6427,11 @@
         <w:rPr>
           <w:b/>
         </w:rPr>
-        <w:t>Тестування:</w:t>
+        <w:t>Тестування та якість коду:</w:t>
       </w:r>
       <w:r>
         <w:rPr/>
-        <w:t xml:space="preserve"> Vitest, Supertest, Playwright.</w:t>
+        <w:t xml:space="preserve"> Vitest, Supertest, Playwright, ESLint, Prettier.</w:t>
       </w:r>
     </w:p>
     <w:p>
@@ -5402,7 +6534,7 @@
       </w:r>
       <w:r>
         <w:rPr/>
-        <w:t xml:space="preserve"> kitchen display (таймери, відмітка страв, автоперехід у «Готово»); рекомендації з поясненням; real-time на Web і Mobile з прогнозом часу; служба доставки як окрема система на спільній базі даних (зони, адреси, курʼєри, диспетчерська, події між системами).</w:t>
+        <w:t xml:space="preserve"> kitchen display (таймери, відмітка страв, автоперехід у «Готово»); рекомендації з поясненням; real-time на Web і Mobile з прогнозом часу; служба доставки як окрема система на спільній базі даних (зони, адреси, курʼєри, диспетчерська, події між системами); геолокація доставки; Docker, CI, автоматизовані тести.</w:t>
       </w:r>
     </w:p>
     <w:p>
@@ -5442,7 +6574,7 @@
       </w:pPr>
       <w:r>
         <w:rPr/>
-        <w:t>Система складається з двох незалежних серверних систем, які працюють з однією базою даних (рис. 2.1). Клієнти ніколи не звертаються до бази даних напряму: Web і Mobile надсилають запити до API, API виконує бізнес-логіку і працює з PostgreSQL.</w:t>
+        <w:t>Система складається з двох незалежних серверних систем, які працюють з однією базою даних (рис. 2.1). Клієнти ніколи не звертаються до бази даних напряму: Web і Mobile надсилають запити до API, API виконує бізнес-логіку і працює з PostgreSQL. Так реалізовано базову архітектуру «Web/Mobile → API → Backend → Database».</w:t>
       </w:r>
     </w:p>
     <w:p>
@@ -5464,7 +6596,7 @@
               <a:graphicData uri="http://schemas.openxmlformats.org/drawingml/2006/picture">
                 <pic:pic>
                   <pic:nvPicPr>
-                    <pic:cNvPr id="0" name="arch.png"/>
+                    <pic:cNvPr id="0" name="architecture.png"/>
                     <pic:cNvPicPr/>
                   </pic:nvPicPr>
                   <pic:blipFill>
@@ -5489,7 +6621,7 @@
     </w:p>
     <w:p>
       <w:pPr>
-        <w:spacing w:before="120" w:after="160"/>
+        <w:spacing w:before="120" w:after="200"/>
         <w:ind w:firstLine="0"/>
         <w:jc w:val="center"/>
       </w:pPr>
@@ -5580,7 +6712,7 @@
       </w:r>
       <w:r>
         <w:rPr/>
-        <w:t xml:space="preserve"> — зони, адреси, оформлення й оплата доставки, черга курʼєрів, диспетчерська, статуси доставки.</w:t>
+        <w:t xml:space="preserve"> — зони, геолокація, адреси, оформлення й оплата доставки, черга курʼєрів, диспетчерська, статуси доставки.</w:t>
       </w:r>
     </w:p>
     <w:p>
@@ -5675,7 +6807,7 @@
       </w:r>
       <w:r>
         <w:rPr/>
-        <w:t xml:space="preserve"> — емуляція банку: перевірка картки, 3-D Secure, відмови, повернення коштів.</w:t>
+        <w:t xml:space="preserve"> — зовнішній сервіс, емульований у коді: перевірка картки, 3-D Secure, відмови, повернення коштів.</w:t>
       </w:r>
     </w:p>
     <w:p>
@@ -5735,7 +6867,7 @@
       </w:pPr>
       <w:r>
         <w:rPr/>
-        <w:t>Так Web-застосунок лишається без змін, а доставка працює як окрема система, яку можна запускати, оновлювати й масштабувати незалежно.</w:t>
+        <w:t>Так Web-застосунок лишається без змін, а доставка працює як окрема система, яку можна запускати, оновлювати й масштабувати незалежно. Обидві системи приймають той самий JWT: користувач входить один раз через Restaurant API.</w:t>
       </w:r>
     </w:p>
     <w:p>
@@ -5752,7 +6884,7 @@
       </w:pPr>
       <w:r>
         <w:rPr/>
-        <w:t>Логічна модель бази даних (рис. 2.2) побудована навколо замовлення (orders). Замовлення в залі привʼязане до бронювання-візиту і столика, а замовлення на доставку — до запису доставки з адресою, зоною та курʼєром. Тип замовлення (DINE_IN або DELIVERY) зберігається в самій таблиці orders, тому кухня, оплати, відгуки й аналітика працюють однаково для обох типів. Схема нормалізована до 3НФ, містить 14 таблиць і реалізована в PostgreSQL 16 через міграції Prisma ORM.</w:t>
+        <w:t>Логічна модель бази даних (рис. 2.2) побудована навколо замовлення (orders). Замовлення в залі привʼязане до бронювання-візиту і столика, а замовлення на доставку — до запису доставки з адресою, зоною та курʼєром. Тип замовлення (DINE_IN або DELIVERY) зберігається в самій таблиці orders, тому кухня, оплати, відгуки й аналітика працюють однаково для обох типів. Схема нормалізована до 3НФ, містить 14 таблиць і реалізована в PostgreSQL 16 через міграції Prisma ORM; обмеження, які не виражаються засобами ORM (EXCLUDE, часткові унікальні індекси, CHECK, тригер), додано окремими SQL-блоками в міграціях.</w:t>
       </w:r>
     </w:p>
     <w:p>
@@ -5774,7 +6906,7 @@
               <a:graphicData uri="http://schemas.openxmlformats.org/drawingml/2006/picture">
                 <pic:pic>
                   <pic:nvPicPr>
-                    <pic:cNvPr id="0" name="er.png"/>
+                    <pic:cNvPr id="0" name="er-diagram.png"/>
                     <pic:cNvPicPr/>
                   </pic:nvPicPr>
                   <pic:blipFill>
@@ -5799,13 +6931,13 @@
     </w:p>
     <w:p>
       <w:pPr>
-        <w:spacing w:before="120" w:after="160"/>
+        <w:spacing w:before="120" w:after="200"/>
         <w:ind w:firstLine="0"/>
         <w:jc w:val="center"/>
       </w:pPr>
       <w:r>
         <w:rPr/>
-        <w:t>Рис. 2.2. Логічна модель бази даних (ER-діаграма)</w:t>
+        <w:t>Рис. 2.2. Логічна модель бази даних</w:t>
       </w:r>
     </w:p>
     <w:p>
@@ -5880,7 +7012,7 @@
       </w:r>
       <w:r>
         <w:rPr/>
-        <w:t xml:space="preserve"> delivery_zones (зони з тарифами), addresses (адреси клієнтів), deliveries (доставка замовлення: отримувач, телефон, знімок адреси, курʼєр, тариф, час виїзду і вручення).</w:t>
+        <w:t xml:space="preserve"> delivery_zones (зони з тарифами, центром і радіусом для геолокації), addresses (адреси клієнтів), deliveries (доставка замовлення: отримувач, телефон, знімок адреси, курʼєр, тариф, час виїзду і вручення).</w:t>
       </w:r>
     </w:p>
     <w:p>
@@ -6028,11 +7160,39 @@
         <w:rPr>
           <w:b/>
         </w:rPr>
+        <w:t>delivery_zones_center_pair, delivery_zones_radius_range</w:t>
+      </w:r>
+      <w:r>
+        <w:rPr/>
+        <w:t xml:space="preserve"> (CHECK): центр зони задається обома координатами, радіус — від 0,5 до 50 км;</w:t>
+      </w:r>
+    </w:p>
+    <w:p>
+      <w:pPr>
+        <w:spacing w:before="0" w:after="0"/>
+      </w:pPr>
+      <w:r>
+        <w:rPr/>
+        <w:t xml:space="preserve">– </w:t>
+      </w:r>
+      <w:r>
+        <w:rPr>
+          <w:b/>
+        </w:rPr>
         <w:t>CHECK для сум і кількостей:</w:t>
       </w:r>
       <w:r>
         <w:rPr/>
         <w:t xml:space="preserve"> ціни, тарифи, кількість і суми лише в допустимих межах; гроші зберігаються в копійках.</w:t>
+      </w:r>
+    </w:p>
+    <w:p>
+      <w:pPr>
+        <w:spacing w:before="0" w:after="0"/>
+      </w:pPr>
+      <w:r>
+        <w:rPr/>
+        <w:t>Для частих запитів створено індекси: бронювання столика за часом, замовлення за статусом і датою (зокрема складений індекс type, status, created_at для черги кухні й диспетчерської), доставки за курʼєром і зоною, адреси за користувачем.</w:t>
       </w:r>
     </w:p>
     <w:p>

</xml_diff>